<commit_message>
Initial DFA implementation done
- Tokens used for classifying resumes
- Must check for more resumes
</commit_message>
<xml_diff>
--- a/data/sample_resumes/entry-level-software-engineer-resume-example.docx
+++ b/data/sample_resumes/entry-level-software-engineer-resume-example.docx
@@ -1,46 +1,32 @@
 
 <file path=word/document.xml><?xml version="1.0" encoding="utf-8"?>
-<w:document xmlns:wpc="http://schemas.microsoft.com/office/word/2010/wordprocessingCanvas" xmlns:cx="http://schemas.microsoft.com/office/drawing/2014/chartex" xmlns:cx1="http://schemas.microsoft.com/office/drawing/2015/9/8/chartex" xmlns:cx2="http://schemas.microsoft.com/office/drawing/2015/10/21/chartex" xmlns:cx3="http://schemas.microsoft.com/office/drawing/2016/5/9/chartex" xmlns:cx4="http://schemas.microsoft.com/office/drawing/2016/5/10/chartex" xmlns:cx5="http://schemas.microsoft.com/office/drawing/2016/5/11/chartex" xmlns:cx6="http://schemas.microsoft.com/office/drawing/2016/5/12/chartex" xmlns:cx7="http://schemas.microsoft.com/office/drawing/2016/5/13/chartex" xmlns:cx8="http://schemas.microsoft.com/office/drawing/2016/5/14/chartex" xmlns:mc="http://schemas.openxmlformats.org/markup-compatibility/2006" xmlns:aink="http://schemas.microsoft.com/office/drawing/2016/ink" xmlns:am3d="http://schemas.microsoft.com/office/drawing/2017/model3d" xmlns:o="urn:schemas-microsoft-com:office:office" xmlns:oel="http://schemas.microsoft.com/office/2019/extlst" xmlns:r="http://schemas.openxmlformats.org/officeDocument/2006/relationships" xmlns:m="http://schemas.openxmlformats.org/officeDocument/2006/math" xmlns:v="urn:schemas-microsoft-com:vml" xmlns:wp14="http://schemas.microsoft.com/office/word/2010/wordprocessingDrawing" xmlns:wp="http://schemas.openxmlformats.org/drawingml/2006/wordprocessingDrawing" xmlns:w10="urn:schemas-microsoft-com:office:word" xmlns:w="http://schemas.openxmlformats.org/wordprocessingml/2006/main" xmlns:w14="http://schemas.microsoft.com/office/word/2010/wordml" xmlns:w15="http://schemas.microsoft.com/office/word/2012/wordml" xmlns:w16cex="http://schemas.microsoft.com/office/word/2018/wordml/cex" xmlns:w16cid="http://schemas.microsoft.com/office/word/2016/wordml/cid" xmlns:w16="http://schemas.microsoft.com/office/word/2018/wordml" xmlns:w16sdtdh="http://schemas.microsoft.com/office/word/2020/wordml/sdtdatahash" xmlns:w16se="http://schemas.microsoft.com/office/word/2015/wordml/symex" xmlns:wpg="http://schemas.microsoft.com/office/word/2010/wordprocessingGroup" xmlns:wpi="http://schemas.microsoft.com/office/word/2010/wordprocessingInk" xmlns:wne="http://schemas.microsoft.com/office/word/2006/wordml" xmlns:wps="http://schemas.microsoft.com/office/word/2010/wordprocessingShape" mc:Ignorable="w14 w15 w16se w16cid w16 w16cex w16sdtdh wp14">
+<w:document xmlns:wpc="http://schemas.microsoft.com/office/word/2010/wordprocessingCanvas" xmlns:cx="http://schemas.microsoft.com/office/drawing/2014/chartex" xmlns:cx1="http://schemas.microsoft.com/office/drawing/2015/9/8/chartex" xmlns:cx2="http://schemas.microsoft.com/office/drawing/2015/10/21/chartex" xmlns:cx3="http://schemas.microsoft.com/office/drawing/2016/5/9/chartex" xmlns:cx4="http://schemas.microsoft.com/office/drawing/2016/5/10/chartex" xmlns:cx5="http://schemas.microsoft.com/office/drawing/2016/5/11/chartex" xmlns:cx6="http://schemas.microsoft.com/office/drawing/2016/5/12/chartex" xmlns:cx7="http://schemas.microsoft.com/office/drawing/2016/5/13/chartex" xmlns:cx8="http://schemas.microsoft.com/office/drawing/2016/5/14/chartex" xmlns:mc="http://schemas.openxmlformats.org/markup-compatibility/2006" xmlns:aink="http://schemas.microsoft.com/office/drawing/2016/ink" xmlns:am3d="http://schemas.microsoft.com/office/drawing/2017/model3d" xmlns:o="urn:schemas-microsoft-com:office:office" xmlns:oel="http://schemas.microsoft.com/office/2019/extlst" xmlns:r="http://schemas.openxmlformats.org/officeDocument/2006/relationships" xmlns:m="http://schemas.openxmlformats.org/officeDocument/2006/math" xmlns:v="urn:schemas-microsoft-com:vml" xmlns:wp14="http://schemas.microsoft.com/office/word/2010/wordprocessingDrawing" xmlns:wp="http://schemas.openxmlformats.org/drawingml/2006/wordprocessingDrawing" xmlns:w10="urn:schemas-microsoft-com:office:word" xmlns:w="http://schemas.openxmlformats.org/wordprocessingml/2006/main" xmlns:w14="http://schemas.microsoft.com/office/word/2010/wordml" xmlns:w15="http://schemas.microsoft.com/office/word/2012/wordml" xmlns:w16cex="http://schemas.microsoft.com/office/word/2018/wordml/cex" xmlns:w16cid="http://schemas.microsoft.com/office/word/2016/wordml/cid" xmlns:w16="http://schemas.microsoft.com/office/word/2018/wordml" xmlns:w16du="http://schemas.microsoft.com/office/word/2023/wordml/word16du" xmlns:w16sdtdh="http://schemas.microsoft.com/office/word/2020/wordml/sdtdatahash" xmlns:w16sdtfl="http://schemas.microsoft.com/office/word/2024/wordml/sdtformatlock" xmlns:w16se="http://schemas.microsoft.com/office/word/2015/wordml/symex" xmlns:wpg="http://schemas.microsoft.com/office/word/2010/wordprocessingGroup" xmlns:wpi="http://schemas.microsoft.com/office/word/2010/wordprocessingInk" xmlns:wne="http://schemas.microsoft.com/office/word/2006/wordml" xmlns:wps="http://schemas.microsoft.com/office/word/2010/wordprocessingShape" mc:Ignorable="w14 w15 w16se w16cid w16 w16cex w16sdtdh w16sdtfl w16du wp14">
   <w:background w:color="FFFFFF"/>
   <w:body>
-    <w:p>
-      <w:pPr>
-        <w:widowControl w:val="0"/>
-        <w:pBdr>
-          <w:top w:val="nil"/>
-          <w:left w:val="nil"/>
-          <w:bottom w:val="nil"/>
-          <w:right w:val="nil"/>
-          <w:between w:val="nil"/>
-        </w:pBdr>
-        <w:spacing w:after="0" w:line="276" w:lineRule="auto"/>
-        <w:rPr>
-          <w:rFonts w:ascii="Arial" w:eastAsia="Arial" w:hAnsi="Arial" w:cs="Arial"/>
-          <w:color w:val="000000"/>
-        </w:rPr>
-      </w:pPr>
-    </w:p>
     <w:tbl>
       <w:tblPr>
         <w:tblStyle w:val="a0"/>
-        <w:tblW w:w="11193" w:type="dxa"/>
+        <w:tblW w:w="11301" w:type="dxa"/>
+        <w:tblInd w:w="-108" w:type="dxa"/>
         <w:tblLayout w:type="fixed"/>
         <w:tblLook w:val="0400" w:firstRow="0" w:lastRow="0" w:firstColumn="0" w:lastColumn="0" w:noHBand="0" w:noVBand="1"/>
       </w:tblPr>
       <w:tblGrid>
-        <w:gridCol w:w="8363"/>
-        <w:gridCol w:w="136"/>
-        <w:gridCol w:w="2596"/>
-        <w:gridCol w:w="98"/>
+        <w:gridCol w:w="108"/>
+        <w:gridCol w:w="2830"/>
+        <w:gridCol w:w="5669"/>
+        <w:gridCol w:w="2694"/>
       </w:tblGrid>
       <w:tr>
         <w:trPr>
+          <w:gridBefore w:val="1"/>
+          <w:wBefore w:w="108" w:type="dxa"/>
           <w:trHeight w:val="705"/>
         </w:trPr>
         <w:tc>
           <w:tcPr>
-            <w:tcW w:w="11194" w:type="dxa"/>
-            <w:gridSpan w:val="4"/>
+            <w:tcW w:w="11193" w:type="dxa"/>
+            <w:gridSpan w:val="3"/>
             <w:tcBorders>
               <w:bottom w:val="nil"/>
             </w:tcBorders>
@@ -64,29 +50,21 @@
                 <w:sz w:val="48"/>
                 <w:szCs w:val="48"/>
               </w:rPr>
-              <w:t>YOUR NAM</w:t>
-            </w:r>
-            <w:r>
-              <w:rPr>
-                <w:rFonts w:ascii="STIX Two Text" w:eastAsia="STIX Two Text" w:hAnsi="STIX Two Text" w:cs="STIX Two Text"/>
-                <w:b/>
-                <w:color w:val="1D3B62"/>
-                <w:sz w:val="48"/>
-                <w:szCs w:val="48"/>
-              </w:rPr>
-              <w:t>E</w:t>
+              <w:t>Austin Alexander</w:t>
             </w:r>
           </w:p>
         </w:tc>
       </w:tr>
       <w:tr>
         <w:trPr>
+          <w:gridBefore w:val="1"/>
+          <w:wBefore w:w="108" w:type="dxa"/>
           <w:trHeight w:val="495"/>
         </w:trPr>
         <w:tc>
           <w:tcPr>
-            <w:tcW w:w="11194" w:type="dxa"/>
-            <w:gridSpan w:val="4"/>
+            <w:tcW w:w="11193" w:type="dxa"/>
+            <w:gridSpan w:val="3"/>
             <w:tcBorders>
               <w:top w:val="nil"/>
               <w:bottom w:val="nil"/>
@@ -159,7 +137,7 @@
               <w:rPr>
                 <w:rFonts w:ascii="STIX Two Text" w:eastAsia="STIX Two Text" w:hAnsi="STIX Two Text" w:cs="STIX Two Text"/>
               </w:rPr>
-              <w:t xml:space="preserve"> | your.name</w:t>
+              <w:t xml:space="preserve"> | austin28</w:t>
             </w:r>
             <w:r>
               <w:rPr>
@@ -173,12 +151,14 @@
       </w:tr>
       <w:tr>
         <w:trPr>
+          <w:gridBefore w:val="1"/>
+          <w:wBefore w:w="108" w:type="dxa"/>
           <w:trHeight w:val="142"/>
         </w:trPr>
         <w:tc>
           <w:tcPr>
-            <w:tcW w:w="11194" w:type="dxa"/>
-            <w:gridSpan w:val="4"/>
+            <w:tcW w:w="11193" w:type="dxa"/>
+            <w:gridSpan w:val="3"/>
             <w:tcBorders>
               <w:top w:val="nil"/>
             </w:tcBorders>
@@ -197,12 +177,14 @@
       </w:tr>
       <w:tr>
         <w:trPr>
+          <w:gridBefore w:val="1"/>
+          <w:wBefore w:w="108" w:type="dxa"/>
           <w:trHeight w:val="954"/>
         </w:trPr>
         <w:tc>
           <w:tcPr>
-            <w:tcW w:w="11194" w:type="dxa"/>
-            <w:gridSpan w:val="4"/>
+            <w:tcW w:w="11193" w:type="dxa"/>
+            <w:gridSpan w:val="3"/>
           </w:tcPr>
           <w:p>
             <w:pPr>
@@ -219,17 +201,27 @@
               </w:rPr>
               <w:t>Recent Software Engineering graduate with fundamental knowledge of software design, development, and testing. Seeking to utilize broad educational background with excellent analytical, technical, and programming skills to thrive as an entry-level software engineer.</w:t>
             </w:r>
+          </w:p>
+          <w:p>
+            <w:pPr>
+              <w:rPr>
+                <w:rFonts w:ascii="STIX Two Text" w:eastAsia="STIX Two Text" w:hAnsi="STIX Two Text" w:cs="STIX Two Text"/>
+                <w:i/>
+              </w:rPr>
+            </w:pPr>
           </w:p>
         </w:tc>
       </w:tr>
       <w:tr>
         <w:trPr>
+          <w:gridBefore w:val="1"/>
+          <w:wBefore w:w="108" w:type="dxa"/>
           <w:trHeight w:val="195"/>
         </w:trPr>
         <w:tc>
           <w:tcPr>
-            <w:tcW w:w="11194" w:type="dxa"/>
-            <w:gridSpan w:val="4"/>
+            <w:tcW w:w="11193" w:type="dxa"/>
+            <w:gridSpan w:val="3"/>
             <w:tcBorders>
               <w:bottom w:val="nil"/>
             </w:tcBorders>
@@ -242,6 +234,688 @@
                 <w:color w:val="1D3B62"/>
                 <w:sz w:val="16"/>
                 <w:szCs w:val="16"/>
+              </w:rPr>
+            </w:pPr>
+          </w:p>
+        </w:tc>
+      </w:tr>
+      <w:tr>
+        <w:trPr>
+          <w:gridBefore w:val="1"/>
+          <w:wBefore w:w="108" w:type="dxa"/>
+          <w:trHeight w:val="116"/>
+        </w:trPr>
+        <w:tc>
+          <w:tcPr>
+            <w:tcW w:w="11193" w:type="dxa"/>
+            <w:gridSpan w:val="3"/>
+            <w:tcBorders>
+              <w:bottom w:val="nil"/>
+            </w:tcBorders>
+          </w:tcPr>
+          <w:p>
+            <w:pPr>
+              <w:rPr>
+                <w:rFonts w:ascii="STIX Two Text" w:eastAsia="STIX Two Text" w:hAnsi="STIX Two Text" w:cs="STIX Two Text"/>
+                <w:b/>
+                <w:sz w:val="24"/>
+                <w:szCs w:val="24"/>
+              </w:rPr>
+            </w:pPr>
+            <w:r>
+              <w:rPr>
+                <w:rFonts w:ascii="STIX Two Text" w:eastAsia="STIX Two Text" w:hAnsi="STIX Two Text" w:cs="STIX Two Text"/>
+                <w:b/>
+                <w:color w:val="1D3B62"/>
+                <w:sz w:val="24"/>
+                <w:szCs w:val="24"/>
+              </w:rPr>
+              <w:t>WORK EXPERIENCE</w:t>
+            </w:r>
+          </w:p>
+        </w:tc>
+      </w:tr>
+      <w:tr>
+        <w:trPr>
+          <w:gridBefore w:val="1"/>
+          <w:wBefore w:w="108" w:type="dxa"/>
+        </w:trPr>
+        <w:tc>
+          <w:tcPr>
+            <w:tcW w:w="11193" w:type="dxa"/>
+            <w:gridSpan w:val="3"/>
+            <w:tcBorders>
+              <w:top w:val="nil"/>
+            </w:tcBorders>
+          </w:tcPr>
+          <w:p>
+            <w:pPr>
+              <w:rPr>
+                <w:rFonts w:ascii="STIX Two Text" w:eastAsia="STIX Two Text" w:hAnsi="STIX Two Text" w:cs="STIX Two Text"/>
+                <w:b/>
+                <w:sz w:val="16"/>
+                <w:szCs w:val="16"/>
+              </w:rPr>
+            </w:pPr>
+          </w:p>
+        </w:tc>
+      </w:tr>
+      <w:tr>
+        <w:trPr>
+          <w:gridBefore w:val="1"/>
+          <w:wBefore w:w="108" w:type="dxa"/>
+        </w:trPr>
+        <w:tc>
+          <w:tcPr>
+            <w:tcW w:w="8499" w:type="dxa"/>
+            <w:gridSpan w:val="2"/>
+          </w:tcPr>
+          <w:p>
+            <w:pPr>
+              <w:pBdr>
+                <w:top w:val="nil"/>
+                <w:left w:val="nil"/>
+                <w:bottom w:val="nil"/>
+                <w:right w:val="nil"/>
+                <w:between w:val="nil"/>
+              </w:pBdr>
+              <w:rPr>
+                <w:rFonts w:ascii="STIX Two Text" w:eastAsia="STIX Two Text" w:hAnsi="STIX Two Text" w:cs="STIX Two Text"/>
+                <w:b/>
+                <w:color w:val="000000"/>
+              </w:rPr>
+            </w:pPr>
+            <w:r>
+              <w:rPr>
+                <w:rFonts w:ascii="STIX Two Text" w:eastAsia="STIX Two Text" w:hAnsi="STIX Two Text" w:cs="STIX Two Text"/>
+                <w:b/>
+              </w:rPr>
+              <w:t>REDFORD &amp; SONS</w:t>
+            </w:r>
+          </w:p>
+          <w:p>
+            <w:pPr>
+              <w:rPr>
+                <w:rFonts w:ascii="STIX Two Text" w:eastAsia="STIX Two Text" w:hAnsi="STIX Two Text" w:cs="STIX Two Text"/>
+              </w:rPr>
+            </w:pPr>
+            <w:r>
+              <w:rPr>
+                <w:rFonts w:ascii="STIX Two Text" w:eastAsia="STIX Two Text" w:hAnsi="STIX Two Text" w:cs="STIX Two Text"/>
+                <w:color w:val="000000"/>
+              </w:rPr>
+              <w:t>S</w:t>
+            </w:r>
+            <w:r>
+              <w:rPr>
+                <w:rFonts w:ascii="STIX Two Text" w:eastAsia="STIX Two Text" w:hAnsi="STIX Two Text" w:cs="STIX Two Text"/>
+              </w:rPr>
+              <w:t>oftware Engineer Intern</w:t>
+            </w:r>
+          </w:p>
+        </w:tc>
+        <w:tc>
+          <w:tcPr>
+            <w:tcW w:w="2694" w:type="dxa"/>
+          </w:tcPr>
+          <w:p>
+            <w:pPr>
+              <w:pBdr>
+                <w:top w:val="nil"/>
+                <w:left w:val="nil"/>
+                <w:bottom w:val="nil"/>
+                <w:right w:val="nil"/>
+                <w:between w:val="nil"/>
+              </w:pBdr>
+              <w:jc w:val="right"/>
+              <w:rPr>
+                <w:rFonts w:ascii="STIX Two Text" w:eastAsia="STIX Two Text" w:hAnsi="STIX Two Text" w:cs="STIX Two Text"/>
+                <w:i/>
+                <w:color w:val="000000"/>
+              </w:rPr>
+            </w:pPr>
+            <w:r>
+              <w:rPr>
+                <w:rFonts w:ascii="STIX Two Text" w:eastAsia="STIX Two Text" w:hAnsi="STIX Two Text" w:cs="STIX Two Text"/>
+                <w:b/>
+              </w:rPr>
+              <w:t>Austin</w:t>
+            </w:r>
+            <w:r>
+              <w:rPr>
+                <w:rFonts w:ascii="STIX Two Text" w:eastAsia="STIX Two Text" w:hAnsi="STIX Two Text" w:cs="STIX Two Text"/>
+                <w:b/>
+                <w:color w:val="000000"/>
+              </w:rPr>
+              <w:t>, TX</w:t>
+            </w:r>
+            <w:r>
+              <w:rPr>
+                <w:rFonts w:ascii="STIX Two Text" w:eastAsia="STIX Two Text" w:hAnsi="STIX Two Text" w:cs="STIX Two Text"/>
+                <w:i/>
+                <w:color w:val="000000"/>
+              </w:rPr>
+              <w:t xml:space="preserve"> </w:t>
+            </w:r>
+          </w:p>
+          <w:p>
+            <w:pPr>
+              <w:spacing w:line="360" w:lineRule="auto"/>
+              <w:jc w:val="right"/>
+              <w:rPr>
+                <w:rFonts w:ascii="STIX Two Text" w:eastAsia="STIX Two Text" w:hAnsi="STIX Two Text" w:cs="STIX Two Text"/>
+                <w:i/>
+              </w:rPr>
+            </w:pPr>
+            <w:r>
+              <w:rPr>
+                <w:rFonts w:ascii="STIX Two Text" w:eastAsia="STIX Two Text" w:hAnsi="STIX Two Text" w:cs="STIX Two Text"/>
+                <w:i/>
+                <w:color w:val="000000"/>
+              </w:rPr>
+              <w:t>August 202</w:t>
+            </w:r>
+            <w:r>
+              <w:rPr>
+                <w:rFonts w:ascii="STIX Two Text" w:eastAsia="STIX Two Text" w:hAnsi="STIX Two Text" w:cs="STIX Two Text"/>
+                <w:i/>
+              </w:rPr>
+              <w:t>2</w:t>
+            </w:r>
+            <w:r>
+              <w:rPr>
+                <w:rFonts w:ascii="STIX Two Text" w:eastAsia="STIX Two Text" w:hAnsi="STIX Two Text" w:cs="STIX Two Text"/>
+                <w:i/>
+                <w:color w:val="000000"/>
+              </w:rPr>
+              <w:t>–Present</w:t>
+            </w:r>
+            <w:r>
+              <w:rPr>
+                <w:rFonts w:ascii="STIX Two Text" w:eastAsia="STIX Two Text" w:hAnsi="STIX Two Text" w:cs="STIX Two Text"/>
+                <w:b/>
+                <w:i/>
+                <w:color w:val="000000"/>
+              </w:rPr>
+              <w:t xml:space="preserve"> </w:t>
+            </w:r>
+          </w:p>
+        </w:tc>
+      </w:tr>
+      <w:tr>
+        <w:trPr>
+          <w:gridBefore w:val="1"/>
+          <w:wBefore w:w="108" w:type="dxa"/>
+          <w:trHeight w:val="220"/>
+        </w:trPr>
+        <w:tc>
+          <w:tcPr>
+            <w:tcW w:w="11193" w:type="dxa"/>
+            <w:gridSpan w:val="3"/>
+          </w:tcPr>
+          <w:p>
+            <w:pPr>
+              <w:numPr>
+                <w:ilvl w:val="0"/>
+                <w:numId w:val="3"/>
+              </w:numPr>
+              <w:spacing w:after="60"/>
+              <w:ind w:left="641" w:right="851" w:hanging="357"/>
+              <w:rPr>
+                <w:rFonts w:ascii="STIX Two Text" w:eastAsia="STIX Two Text" w:hAnsi="STIX Two Text" w:cs="STIX Two Text"/>
+                <w:i/>
+              </w:rPr>
+            </w:pPr>
+            <w:r>
+              <w:rPr>
+                <w:rFonts w:ascii="STIX Two Text" w:eastAsia="STIX Two Text" w:hAnsi="STIX Two Text" w:cs="STIX Two Text"/>
+              </w:rPr>
+              <w:t>Employ best coding practices and object-oriented programming techniques such as abstraction and association to work on full-stack software development projects</w:t>
+            </w:r>
+          </w:p>
+          <w:p>
+            <w:pPr>
+              <w:numPr>
+                <w:ilvl w:val="0"/>
+                <w:numId w:val="3"/>
+              </w:numPr>
+              <w:spacing w:after="60"/>
+              <w:ind w:left="641" w:right="851" w:hanging="357"/>
+              <w:rPr>
+                <w:rFonts w:ascii="STIX Two Text" w:eastAsia="STIX Two Text" w:hAnsi="STIX Two Text" w:cs="STIX Two Text"/>
+                <w:i/>
+              </w:rPr>
+            </w:pPr>
+            <w:r>
+              <w:rPr>
+                <w:rFonts w:ascii="STIX Two Text" w:eastAsia="STIX Two Text" w:hAnsi="STIX Two Text" w:cs="STIX Two Text"/>
+              </w:rPr>
+              <w:t>Work as a part of a 5-member team to release and update 20+ custom .NET service-oriented applications for company clients in health and insurance niches</w:t>
+            </w:r>
+          </w:p>
+          <w:p>
+            <w:pPr>
+              <w:numPr>
+                <w:ilvl w:val="0"/>
+                <w:numId w:val="3"/>
+              </w:numPr>
+              <w:spacing w:after="60"/>
+              <w:ind w:left="641" w:right="851" w:hanging="357"/>
+              <w:rPr>
+                <w:rFonts w:ascii="STIX Two Text" w:eastAsia="STIX Two Text" w:hAnsi="STIX Two Text" w:cs="STIX Two Text"/>
+                <w:i/>
+              </w:rPr>
+            </w:pPr>
+            <w:r>
+              <w:rPr>
+                <w:rFonts w:ascii="STIX Two Text" w:eastAsia="STIX Two Text" w:hAnsi="STIX Two Text" w:cs="STIX Two Text"/>
+              </w:rPr>
+              <w:t>Decreased software testing time by 15% by developing automated test scripts to alleviate testing bottleneck caused by large volume of tests</w:t>
+            </w:r>
+          </w:p>
+          <w:p>
+            <w:pPr>
+              <w:numPr>
+                <w:ilvl w:val="0"/>
+                <w:numId w:val="3"/>
+              </w:numPr>
+              <w:spacing w:after="60"/>
+              <w:ind w:left="641" w:right="851" w:hanging="357"/>
+              <w:rPr>
+                <w:rFonts w:ascii="STIX Two Text" w:eastAsia="STIX Two Text" w:hAnsi="STIX Two Text" w:cs="STIX Two Text"/>
+                <w:i/>
+              </w:rPr>
+            </w:pPr>
+            <w:r>
+              <w:rPr>
+                <w:rFonts w:ascii="STIX Two Text" w:eastAsia="STIX Two Text" w:hAnsi="STIX Two Text" w:cs="STIX Two Text"/>
+              </w:rPr>
+              <w:t>Create, test, and deploy applications on custom hardware</w:t>
+            </w:r>
+          </w:p>
+          <w:p>
+            <w:pPr>
+              <w:rPr>
+                <w:rFonts w:ascii="STIX Two Text" w:eastAsia="STIX Two Text" w:hAnsi="STIX Two Text" w:cs="STIX Two Text"/>
+                <w:b/>
+              </w:rPr>
+            </w:pPr>
+            <w:r>
+              <w:rPr>
+                <w:rFonts w:ascii="STIX Two Text" w:eastAsia="STIX Two Text" w:hAnsi="STIX Two Text" w:cs="STIX Two Text"/>
+              </w:rPr>
+              <w:t>Reduced loading time by 80% by refactoring student library website's legacy JavaScript codebase</w:t>
+            </w:r>
+          </w:p>
+        </w:tc>
+      </w:tr>
+      <w:tr>
+        <w:trPr>
+          <w:gridBefore w:val="1"/>
+          <w:wBefore w:w="108" w:type="dxa"/>
+          <w:trHeight w:val="240"/>
+        </w:trPr>
+        <w:tc>
+          <w:tcPr>
+            <w:tcW w:w="11193" w:type="dxa"/>
+            <w:gridSpan w:val="3"/>
+          </w:tcPr>
+          <w:p>
+            <w:pPr>
+              <w:rPr>
+                <w:rFonts w:ascii="STIX Two Text" w:eastAsia="STIX Two Text" w:hAnsi="STIX Two Text" w:cs="STIX Two Text"/>
+                <w:b/>
+              </w:rPr>
+            </w:pPr>
+          </w:p>
+        </w:tc>
+      </w:tr>
+      <w:tr>
+        <w:trPr>
+          <w:gridBefore w:val="1"/>
+          <w:wBefore w:w="108" w:type="dxa"/>
+          <w:trHeight w:val="220"/>
+        </w:trPr>
+        <w:tc>
+          <w:tcPr>
+            <w:tcW w:w="11193" w:type="dxa"/>
+            <w:gridSpan w:val="3"/>
+          </w:tcPr>
+          <w:p>
+            <w:pPr>
+              <w:rPr>
+                <w:rFonts w:ascii="STIX Two Text" w:eastAsia="STIX Two Text" w:hAnsi="STIX Two Text" w:cs="STIX Two Text"/>
+                <w:b/>
+              </w:rPr>
+            </w:pPr>
+          </w:p>
+          <w:tbl>
+            <w:tblPr>
+              <w:tblStyle w:val="a0"/>
+              <w:tblW w:w="11301" w:type="dxa"/>
+              <w:tblLayout w:type="fixed"/>
+              <w:tblLook w:val="0400" w:firstRow="0" w:lastRow="0" w:firstColumn="0" w:lastColumn="0" w:noHBand="0" w:noVBand="1"/>
+            </w:tblPr>
+            <w:tblGrid>
+              <w:gridCol w:w="8444"/>
+              <w:gridCol w:w="2857"/>
+            </w:tblGrid>
+            <w:tr>
+              <w:trPr>
+                <w:trHeight w:val="371"/>
+              </w:trPr>
+              <w:tc>
+                <w:tcPr>
+                  <w:tcW w:w="11193" w:type="dxa"/>
+                  <w:gridSpan w:val="2"/>
+                </w:tcPr>
+                <w:p>
+                  <w:pPr>
+                    <w:rPr>
+                      <w:rFonts w:ascii="STIX Two Text" w:eastAsia="STIX Two Text" w:hAnsi="STIX Two Text" w:cs="STIX Two Text"/>
+                      <w:color w:val="000000"/>
+                    </w:rPr>
+                  </w:pPr>
+                  <w:r>
+                    <w:rPr>
+                      <w:rFonts w:ascii="STIX Two Text" w:eastAsia="STIX Two Text" w:hAnsi="STIX Two Text" w:cs="STIX Two Text"/>
+                      <w:b/>
+                      <w:color w:val="1D3B62"/>
+                      <w:sz w:val="24"/>
+                      <w:szCs w:val="24"/>
+                    </w:rPr>
+                    <w:t>PROJECTS</w:t>
+                  </w:r>
+                </w:p>
+              </w:tc>
+            </w:tr>
+            <w:tr>
+              <w:trPr>
+                <w:trHeight w:val="230"/>
+              </w:trPr>
+              <w:tc>
+                <w:tcPr>
+                  <w:tcW w:w="11193" w:type="dxa"/>
+                  <w:gridSpan w:val="2"/>
+                </w:tcPr>
+                <w:p>
+                  <w:pPr>
+                    <w:pBdr>
+                      <w:top w:val="nil"/>
+                      <w:left w:val="nil"/>
+                      <w:bottom w:val="nil"/>
+                      <w:right w:val="nil"/>
+                      <w:between w:val="nil"/>
+                    </w:pBdr>
+                    <w:spacing w:after="60" w:line="259" w:lineRule="auto"/>
+                    <w:ind w:left="641" w:hanging="357"/>
+                    <w:rPr>
+                      <w:rFonts w:ascii="STIX Two Text" w:eastAsia="STIX Two Text" w:hAnsi="STIX Two Text" w:cs="STIX Two Text"/>
+                      <w:color w:val="000000"/>
+                      <w:sz w:val="16"/>
+                      <w:szCs w:val="16"/>
+                    </w:rPr>
+                  </w:pPr>
+                </w:p>
+              </w:tc>
+            </w:tr>
+            <w:tr>
+              <w:trPr>
+                <w:trHeight w:val="765"/>
+              </w:trPr>
+              <w:tc>
+                <w:tcPr>
+                  <w:tcW w:w="8363" w:type="dxa"/>
+                </w:tcPr>
+                <w:p>
+                  <w:pPr>
+                    <w:spacing w:after="60"/>
+                    <w:rPr>
+                      <w:rFonts w:ascii="STIX Two Text" w:eastAsia="STIX Two Text" w:hAnsi="STIX Two Text" w:cs="STIX Two Text"/>
+                      <w:b/>
+                    </w:rPr>
+                  </w:pPr>
+                  <w:r>
+                    <w:rPr>
+                      <w:rFonts w:ascii="STIX Two Text" w:eastAsia="STIX Two Text" w:hAnsi="STIX Two Text" w:cs="STIX Two Text"/>
+                      <w:b/>
+                    </w:rPr>
+                    <w:t>QUICKSILVER BOOKING</w:t>
+                  </w:r>
+                </w:p>
+                <w:p>
+                  <w:pPr>
+                    <w:spacing w:after="60"/>
+                    <w:rPr>
+                      <w:rFonts w:ascii="STIX Two Text" w:eastAsia="STIX Two Text" w:hAnsi="STIX Two Text" w:cs="STIX Two Text"/>
+                    </w:rPr>
+                  </w:pPr>
+                  <w:r>
+                    <w:rPr>
+                      <w:rFonts w:ascii="STIX Two Text" w:eastAsia="STIX Two Text" w:hAnsi="STIX Two Text" w:cs="STIX Two Text"/>
+                    </w:rPr>
+                    <w:t>Developer</w:t>
+                  </w:r>
+                </w:p>
+              </w:tc>
+              <w:tc>
+                <w:tcPr>
+                  <w:tcW w:w="2830" w:type="dxa"/>
+                </w:tcPr>
+                <w:p>
+                  <w:pPr>
+                    <w:jc w:val="center"/>
+                    <w:rPr>
+                      <w:rFonts w:ascii="STIX Two Text" w:eastAsia="STIX Two Text" w:hAnsi="STIX Two Text" w:cs="STIX Two Text"/>
+                      <w:i/>
+                    </w:rPr>
+                  </w:pPr>
+                  <w:r>
+                    <w:rPr>
+                      <w:rFonts w:ascii="STIX Two Text" w:eastAsia="STIX Two Text" w:hAnsi="STIX Two Text" w:cs="STIX Two Text"/>
+                      <w:b/>
+                    </w:rPr>
+                    <w:t xml:space="preserve">                      Austin, TX</w:t>
+                  </w:r>
+                  <w:r>
+                    <w:rPr>
+                      <w:rFonts w:ascii="STIX Two Text" w:eastAsia="STIX Two Text" w:hAnsi="STIX Two Text" w:cs="STIX Two Text"/>
+                      <w:i/>
+                    </w:rPr>
+                    <w:t xml:space="preserve"> </w:t>
+                  </w:r>
+                </w:p>
+                <w:p>
+                  <w:pPr>
+                    <w:jc w:val="center"/>
+                    <w:rPr>
+                      <w:rFonts w:ascii="STIX Two Text" w:eastAsia="STIX Two Text" w:hAnsi="STIX Two Text" w:cs="STIX Two Text"/>
+                      <w:b/>
+                      <w:i/>
+                    </w:rPr>
+                  </w:pPr>
+                  <w:r>
+                    <w:rPr>
+                      <w:rFonts w:ascii="STIX Two Text" w:eastAsia="STIX Two Text" w:hAnsi="STIX Two Text" w:cs="STIX Two Text"/>
+                      <w:i/>
+                    </w:rPr>
+                    <w:t xml:space="preserve">          Jan 2022–June 2022</w:t>
+                  </w:r>
+                  <w:r>
+                    <w:rPr>
+                      <w:rFonts w:ascii="STIX Two Text" w:eastAsia="STIX Two Text" w:hAnsi="STIX Two Text" w:cs="STIX Two Text"/>
+                      <w:b/>
+                      <w:i/>
+                    </w:rPr>
+                    <w:t xml:space="preserve"> </w:t>
+                  </w:r>
+                </w:p>
+              </w:tc>
+            </w:tr>
+            <w:tr>
+              <w:trPr>
+                <w:trHeight w:val="371"/>
+              </w:trPr>
+              <w:tc>
+                <w:tcPr>
+                  <w:tcW w:w="11193" w:type="dxa"/>
+                  <w:gridSpan w:val="2"/>
+                </w:tcPr>
+                <w:p>
+                  <w:pPr>
+                    <w:pBdr>
+                      <w:top w:val="nil"/>
+                      <w:left w:val="nil"/>
+                      <w:bottom w:val="nil"/>
+                      <w:right w:val="nil"/>
+                      <w:between w:val="nil"/>
+                    </w:pBdr>
+                    <w:spacing w:after="60" w:line="259" w:lineRule="auto"/>
+                    <w:rPr>
+                      <w:rFonts w:ascii="STIX Two Text" w:eastAsia="STIX Two Text" w:hAnsi="STIX Two Text" w:cs="STIX Two Text"/>
+                    </w:rPr>
+                  </w:pPr>
+                  <w:r>
+                    <w:rPr>
+                      <w:rFonts w:ascii="STIX Two Text" w:eastAsia="STIX Two Text" w:hAnsi="STIX Two Text" w:cs="STIX Two Text"/>
+                      <w:b/>
+                    </w:rPr>
+                    <w:t>Description</w:t>
+                  </w:r>
+                  <w:r>
+                    <w:rPr>
+                      <w:rFonts w:ascii="STIX Two Text" w:eastAsia="STIX Two Text" w:hAnsi="STIX Two Text" w:cs="STIX Two Text"/>
+                    </w:rPr>
+                    <w:t xml:space="preserve">: A mobile hotel booking solution for iOS. Pulls and compares the best hotel prices in a geographical area. </w:t>
+                  </w:r>
+                  <w:r>
+                    <w:rPr>
+                      <w:rFonts w:ascii="STIX Two Text" w:eastAsia="STIX Two Text" w:hAnsi="STIX Two Text" w:cs="STIX Two Text"/>
+                      <w:b/>
+                    </w:rPr>
+                    <w:t>Used</w:t>
+                  </w:r>
+                  <w:r>
+                    <w:rPr>
+                      <w:rFonts w:ascii="STIX Two Text" w:eastAsia="STIX Two Text" w:hAnsi="STIX Two Text" w:cs="STIX Two Text"/>
+                    </w:rPr>
+                    <w:t xml:space="preserve">: Swift, </w:t>
+                  </w:r>
+                  <w:proofErr w:type="spellStart"/>
+                  <w:r>
+                    <w:rPr>
+                      <w:rFonts w:ascii="STIX Two Text" w:eastAsia="STIX Two Text" w:hAnsi="STIX Two Text" w:cs="STIX Two Text"/>
+                    </w:rPr>
+                    <w:t>Javascript</w:t>
+                  </w:r>
+                  <w:proofErr w:type="spellEnd"/>
+                  <w:r>
+                    <w:rPr>
+                      <w:rFonts w:ascii="STIX Two Text" w:eastAsia="STIX Two Text" w:hAnsi="STIX Two Text" w:cs="STIX Two Text"/>
+                    </w:rPr>
+                    <w:t>, C++</w:t>
+                  </w:r>
+                </w:p>
+                <w:p>
+                  <w:pPr>
+                    <w:numPr>
+                      <w:ilvl w:val="0"/>
+                      <w:numId w:val="2"/>
+                    </w:numPr>
+                    <w:pBdr>
+                      <w:top w:val="nil"/>
+                      <w:left w:val="nil"/>
+                      <w:bottom w:val="nil"/>
+                      <w:right w:val="nil"/>
+                      <w:between w:val="nil"/>
+                    </w:pBdr>
+                    <w:spacing w:line="259" w:lineRule="auto"/>
+                    <w:rPr>
+                      <w:rFonts w:ascii="STIX Two Text" w:eastAsia="STIX Two Text" w:hAnsi="STIX Two Text" w:cs="STIX Two Text"/>
+                    </w:rPr>
+                  </w:pPr>
+                  <w:r>
+                    <w:rPr>
+                      <w:rFonts w:ascii="STIX Two Text" w:eastAsia="STIX Two Text" w:hAnsi="STIX Two Text" w:cs="STIX Two Text"/>
+                    </w:rPr>
+                    <w:t>Worked across the development lifecycle to build and maintain code, eliminating 150 unique bugs</w:t>
+                  </w:r>
+                </w:p>
+                <w:p>
+                  <w:pPr>
+                    <w:numPr>
+                      <w:ilvl w:val="0"/>
+                      <w:numId w:val="2"/>
+                    </w:numPr>
+                    <w:pBdr>
+                      <w:top w:val="nil"/>
+                      <w:left w:val="nil"/>
+                      <w:bottom w:val="nil"/>
+                      <w:right w:val="nil"/>
+                      <w:between w:val="nil"/>
+                    </w:pBdr>
+                    <w:spacing w:line="259" w:lineRule="auto"/>
+                    <w:rPr>
+                      <w:rFonts w:ascii="STIX Two Text" w:eastAsia="STIX Two Text" w:hAnsi="STIX Two Text" w:cs="STIX Two Text"/>
+                    </w:rPr>
+                  </w:pPr>
+                  <w:r>
+                    <w:rPr>
+                      <w:rFonts w:ascii="STIX Two Text" w:eastAsia="STIX Two Text" w:hAnsi="STIX Two Text" w:cs="STIX Two Text"/>
+                    </w:rPr>
+                    <w:t>Developed dynamic components for the app and created a new landing page that streamlined customer experience</w:t>
+                  </w:r>
+                </w:p>
+                <w:p>
+                  <w:pPr>
+                    <w:numPr>
+                      <w:ilvl w:val="0"/>
+                      <w:numId w:val="2"/>
+                    </w:numPr>
+                    <w:pBdr>
+                      <w:top w:val="nil"/>
+                      <w:left w:val="nil"/>
+                      <w:bottom w:val="nil"/>
+                      <w:right w:val="nil"/>
+                      <w:between w:val="nil"/>
+                    </w:pBdr>
+                    <w:spacing w:after="60" w:line="259" w:lineRule="auto"/>
+                    <w:rPr>
+                      <w:rFonts w:ascii="STIX Two Text" w:eastAsia="STIX Two Text" w:hAnsi="STIX Two Text" w:cs="STIX Two Text"/>
+                    </w:rPr>
+                  </w:pPr>
+                  <w:r>
+                    <w:rPr>
+                      <w:rFonts w:ascii="STIX Two Text" w:eastAsia="STIX Two Text" w:hAnsi="STIX Two Text" w:cs="STIX Two Text"/>
+                    </w:rPr>
+                    <w:t>Built a new feature using Swift to automatically compare competing discount offers</w:t>
+                  </w:r>
+                </w:p>
+              </w:tc>
+            </w:tr>
+          </w:tbl>
+          <w:p>
+            <w:pPr>
+              <w:rPr>
+                <w:rFonts w:ascii="Poppins" w:eastAsia="Poppins" w:hAnsi="Poppins" w:cs="Poppins"/>
+                <w:sz w:val="2"/>
+                <w:szCs w:val="2"/>
+              </w:rPr>
+            </w:pPr>
+          </w:p>
+          <w:p>
+            <w:pPr>
+              <w:rPr>
+                <w:rFonts w:ascii="STIX Two Text" w:eastAsia="STIX Two Text" w:hAnsi="STIX Two Text" w:cs="STIX Two Text"/>
+                <w:b/>
+              </w:rPr>
+            </w:pPr>
+          </w:p>
+          <w:p>
+            <w:pPr>
+              <w:rPr>
+                <w:rFonts w:ascii="STIX Two Text" w:eastAsia="STIX Two Text" w:hAnsi="STIX Two Text" w:cs="STIX Two Text"/>
+                <w:b/>
               </w:rPr>
             </w:pPr>
           </w:p>
@@ -253,7 +927,7 @@
         </w:trPr>
         <w:tc>
           <w:tcPr>
-            <w:tcW w:w="11194" w:type="dxa"/>
+            <w:tcW w:w="11301" w:type="dxa"/>
             <w:gridSpan w:val="4"/>
             <w:tcBorders>
               <w:bottom w:val="nil"/>
@@ -284,7 +958,7 @@
       <w:tr>
         <w:tc>
           <w:tcPr>
-            <w:tcW w:w="11194" w:type="dxa"/>
+            <w:tcW w:w="11301" w:type="dxa"/>
             <w:gridSpan w:val="4"/>
             <w:tcBorders>
               <w:top w:val="nil"/>
@@ -305,8 +979,8 @@
       <w:tr>
         <w:tc>
           <w:tcPr>
-            <w:tcW w:w="8500" w:type="dxa"/>
-            <w:gridSpan w:val="2"/>
+            <w:tcW w:w="8607" w:type="dxa"/>
+            <w:gridSpan w:val="3"/>
           </w:tcPr>
           <w:p>
             <w:pPr>
@@ -342,19 +1016,11 @@
                 <w:rFonts w:ascii="STIX Two Text" w:eastAsia="STIX Two Text" w:hAnsi="STIX Two Text" w:cs="STIX Two Text"/>
               </w:rPr>
             </w:pPr>
-            <w:proofErr w:type="spellStart"/>
-            <w:r>
-              <w:rPr>
-                <w:rFonts w:ascii="STIX Two Text" w:eastAsia="STIX Two Text" w:hAnsi="STIX Two Text" w:cs="STIX Two Text"/>
-              </w:rPr>
-              <w:t>Honors</w:t>
-            </w:r>
-            <w:proofErr w:type="spellEnd"/>
-            <w:r>
-              <w:rPr>
-                <w:rFonts w:ascii="STIX Two Text" w:eastAsia="STIX Two Text" w:hAnsi="STIX Two Text" w:cs="STIX Two Text"/>
-              </w:rPr>
-              <w:t>: cum laude (GPA: 3.7/4.0) | Dean’s List (2929 &amp; 2021)</w:t>
+            <w:r>
+              <w:rPr>
+                <w:rFonts w:ascii="STIX Two Text" w:eastAsia="STIX Two Text" w:hAnsi="STIX Two Text" w:cs="STIX Two Text"/>
+              </w:rPr>
+              <w:t>Honors: cum laude (GPA: 3.7/4.0) | Dean’s List (2929 &amp; 2021)</w:t>
             </w:r>
           </w:p>
           <w:p>
@@ -388,7 +1054,6 @@
         <w:tc>
           <w:tcPr>
             <w:tcW w:w="2694" w:type="dxa"/>
-            <w:gridSpan w:val="2"/>
           </w:tcPr>
           <w:p>
             <w:pPr>
@@ -427,78 +1092,15 @@
       </w:tr>
       <w:tr>
         <w:trPr>
-          <w:trHeight w:val="220"/>
-        </w:trPr>
-        <w:tc>
-          <w:tcPr>
-            <w:tcW w:w="11194" w:type="dxa"/>
-            <w:gridSpan w:val="4"/>
-          </w:tcPr>
-          <w:p>
-            <w:pPr>
-              <w:rPr>
-                <w:rFonts w:ascii="STIX Two Text" w:eastAsia="STIX Two Text" w:hAnsi="STIX Two Text" w:cs="STIX Two Text"/>
-                <w:b/>
-              </w:rPr>
-            </w:pPr>
-          </w:p>
-        </w:tc>
-      </w:tr>
-      <w:tr>
-        <w:trPr>
-          <w:trHeight w:val="240"/>
-        </w:trPr>
-        <w:tc>
-          <w:tcPr>
-            <w:tcW w:w="11194" w:type="dxa"/>
-            <w:gridSpan w:val="4"/>
-          </w:tcPr>
-          <w:p>
-            <w:pPr>
-              <w:rPr>
-                <w:rFonts w:ascii="STIX Two Text" w:eastAsia="STIX Two Text" w:hAnsi="STIX Two Text" w:cs="STIX Two Text"/>
-                <w:b/>
-              </w:rPr>
-            </w:pPr>
-            <w:r>
-              <w:rPr>
-                <w:rFonts w:ascii="STIX Two Text" w:eastAsia="STIX Two Text" w:hAnsi="STIX Two Text" w:cs="STIX Two Text"/>
-                <w:b/>
-                <w:color w:val="1D3B62"/>
-                <w:sz w:val="24"/>
-                <w:szCs w:val="24"/>
-              </w:rPr>
-              <w:t>PROFESSIONAL EXPERIENCE</w:t>
-            </w:r>
-          </w:p>
-        </w:tc>
-      </w:tr>
-      <w:tr>
-        <w:trPr>
-          <w:trHeight w:val="220"/>
-        </w:trPr>
-        <w:tc>
-          <w:tcPr>
-            <w:tcW w:w="11194" w:type="dxa"/>
-            <w:gridSpan w:val="4"/>
-          </w:tcPr>
-          <w:p>
-            <w:pPr>
-              <w:rPr>
-                <w:rFonts w:ascii="STIX Two Text" w:eastAsia="STIX Two Text" w:hAnsi="STIX Two Text" w:cs="STIX Two Text"/>
-                <w:b/>
-              </w:rPr>
-            </w:pPr>
-          </w:p>
-        </w:tc>
-      </w:tr>
-      <w:tr>
-        <w:trPr>
+          <w:gridBefore w:val="1"/>
+          <w:gridAfter w:val="2"/>
+          <w:wBefore w:w="108" w:type="dxa"/>
+          <w:wAfter w:w="8363" w:type="dxa"/>
           <w:trHeight w:val="672"/>
         </w:trPr>
         <w:tc>
           <w:tcPr>
-            <w:tcW w:w="8364" w:type="dxa"/>
+            <w:tcW w:w="2830" w:type="dxa"/>
           </w:tcPr>
           <w:p>
             <w:pPr>
@@ -512,282 +1114,23 @@
               <w:rPr>
                 <w:rFonts w:ascii="STIX Two Text" w:eastAsia="STIX Two Text" w:hAnsi="STIX Two Text" w:cs="STIX Two Text"/>
                 <w:b/>
-                <w:color w:val="000000"/>
-              </w:rPr>
-            </w:pPr>
-            <w:r>
-              <w:rPr>
-                <w:rFonts w:ascii="STIX Two Text" w:eastAsia="STIX Two Text" w:hAnsi="STIX Two Text" w:cs="STIX Two Text"/>
-                <w:b/>
-              </w:rPr>
-              <w:t>REDFORD &amp; SONS</w:t>
-            </w:r>
-          </w:p>
-          <w:p>
-            <w:pPr>
-              <w:pBdr>
-                <w:top w:val="nil"/>
-                <w:left w:val="nil"/>
-                <w:bottom w:val="nil"/>
-                <w:right w:val="nil"/>
-                <w:between w:val="nil"/>
-              </w:pBdr>
-              <w:rPr>
-                <w:rFonts w:ascii="STIX Two Text" w:eastAsia="STIX Two Text" w:hAnsi="STIX Two Text" w:cs="STIX Two Text"/>
-                <w:color w:val="000000"/>
-              </w:rPr>
-            </w:pPr>
-            <w:r>
-              <w:rPr>
-                <w:rFonts w:ascii="STIX Two Text" w:eastAsia="STIX Two Text" w:hAnsi="STIX Two Text" w:cs="STIX Two Text"/>
-                <w:color w:val="000000"/>
-              </w:rPr>
-              <w:t>S</w:t>
-            </w:r>
-            <w:r>
-              <w:rPr>
-                <w:rFonts w:ascii="STIX Two Text" w:eastAsia="STIX Two Text" w:hAnsi="STIX Two Text" w:cs="STIX Two Text"/>
-              </w:rPr>
-              <w:t>oftware Engineer Intern</w:t>
-            </w:r>
-          </w:p>
-        </w:tc>
-        <w:tc>
-          <w:tcPr>
-            <w:tcW w:w="2830" w:type="dxa"/>
-            <w:gridSpan w:val="3"/>
-          </w:tcPr>
-          <w:p>
-            <w:pPr>
-              <w:pBdr>
-                <w:top w:val="nil"/>
-                <w:left w:val="nil"/>
-                <w:bottom w:val="nil"/>
-                <w:right w:val="nil"/>
-                <w:between w:val="nil"/>
-              </w:pBdr>
-              <w:jc w:val="right"/>
-              <w:rPr>
-                <w:rFonts w:ascii="STIX Two Text" w:eastAsia="STIX Two Text" w:hAnsi="STIX Two Text" w:cs="STIX Two Text"/>
                 <w:i/>
                 <w:color w:val="000000"/>
               </w:rPr>
             </w:pPr>
-            <w:r>
-              <w:rPr>
-                <w:rFonts w:ascii="STIX Two Text" w:eastAsia="STIX Two Text" w:hAnsi="STIX Two Text" w:cs="STIX Two Text"/>
-                <w:b/>
-              </w:rPr>
-              <w:t>Austin</w:t>
-            </w:r>
-            <w:r>
-              <w:rPr>
-                <w:rFonts w:ascii="STIX Two Text" w:eastAsia="STIX Two Text" w:hAnsi="STIX Two Text" w:cs="STIX Two Text"/>
-                <w:b/>
-                <w:color w:val="000000"/>
-              </w:rPr>
-              <w:t>, TX</w:t>
-            </w:r>
-            <w:r>
-              <w:rPr>
-                <w:rFonts w:ascii="STIX Two Text" w:eastAsia="STIX Two Text" w:hAnsi="STIX Two Text" w:cs="STIX Two Text"/>
-                <w:i/>
-                <w:color w:val="000000"/>
-              </w:rPr>
-              <w:t xml:space="preserve"> </w:t>
-            </w:r>
-          </w:p>
-          <w:p>
-            <w:pPr>
-              <w:pBdr>
-                <w:top w:val="nil"/>
-                <w:left w:val="nil"/>
-                <w:bottom w:val="nil"/>
-                <w:right w:val="nil"/>
-                <w:between w:val="nil"/>
-              </w:pBdr>
-              <w:jc w:val="right"/>
-              <w:rPr>
-                <w:rFonts w:ascii="STIX Two Text" w:eastAsia="STIX Two Text" w:hAnsi="STIX Two Text" w:cs="STIX Two Text"/>
-                <w:b/>
-                <w:i/>
-                <w:color w:val="000000"/>
-              </w:rPr>
-            </w:pPr>
-            <w:r>
-              <w:rPr>
-                <w:rFonts w:ascii="STIX Two Text" w:eastAsia="STIX Two Text" w:hAnsi="STIX Two Text" w:cs="STIX Two Text"/>
-                <w:i/>
-                <w:color w:val="000000"/>
-              </w:rPr>
-              <w:t>August 202</w:t>
-            </w:r>
-            <w:r>
-              <w:rPr>
-                <w:rFonts w:ascii="STIX Two Text" w:eastAsia="STIX Two Text" w:hAnsi="STIX Two Text" w:cs="STIX Two Text"/>
-                <w:i/>
-              </w:rPr>
-              <w:t>2</w:t>
-            </w:r>
-            <w:r>
-              <w:rPr>
-                <w:rFonts w:ascii="STIX Two Text" w:eastAsia="STIX Two Text" w:hAnsi="STIX Two Text" w:cs="STIX Two Text"/>
-                <w:i/>
-                <w:color w:val="000000"/>
-              </w:rPr>
-              <w:t>–Present</w:t>
-            </w:r>
-            <w:r>
-              <w:rPr>
-                <w:rFonts w:ascii="STIX Two Text" w:eastAsia="STIX Two Text" w:hAnsi="STIX Two Text" w:cs="STIX Two Text"/>
-                <w:b/>
-                <w:i/>
-                <w:color w:val="000000"/>
-              </w:rPr>
-              <w:t xml:space="preserve"> </w:t>
-            </w:r>
           </w:p>
         </w:tc>
       </w:tr>
       <w:tr>
         <w:trPr>
-          <w:trHeight w:val="2258"/>
-        </w:trPr>
-        <w:tc>
-          <w:tcPr>
-            <w:tcW w:w="11194" w:type="dxa"/>
-            <w:gridSpan w:val="4"/>
-          </w:tcPr>
-          <w:p>
-            <w:pPr>
-              <w:numPr>
-                <w:ilvl w:val="0"/>
-                <w:numId w:val="3"/>
-              </w:numPr>
-              <w:spacing w:after="60"/>
-              <w:ind w:left="641" w:right="851" w:hanging="357"/>
-              <w:rPr>
-                <w:rFonts w:ascii="STIX Two Text" w:eastAsia="STIX Two Text" w:hAnsi="STIX Two Text" w:cs="STIX Two Text"/>
-                <w:i/>
-              </w:rPr>
-            </w:pPr>
-            <w:r>
-              <w:rPr>
-                <w:rFonts w:ascii="STIX Two Text" w:eastAsia="STIX Two Text" w:hAnsi="STIX Two Text" w:cs="STIX Two Text"/>
-              </w:rPr>
-              <w:t>Employ best coding practices and object-oriented programming techniques such as abstraction and association to work on full-stack software development projects</w:t>
-            </w:r>
-          </w:p>
-          <w:p>
-            <w:pPr>
-              <w:numPr>
-                <w:ilvl w:val="0"/>
-                <w:numId w:val="3"/>
-              </w:numPr>
-              <w:spacing w:after="60"/>
-              <w:ind w:left="641" w:right="851" w:hanging="357"/>
-              <w:rPr>
-                <w:rFonts w:ascii="STIX Two Text" w:eastAsia="STIX Two Text" w:hAnsi="STIX Two Text" w:cs="STIX Two Text"/>
-                <w:i/>
-              </w:rPr>
-            </w:pPr>
-            <w:r>
-              <w:rPr>
-                <w:rFonts w:ascii="STIX Two Text" w:eastAsia="STIX Two Text" w:hAnsi="STIX Two Text" w:cs="STIX Two Text"/>
-              </w:rPr>
-              <w:t>Work as a part of a 5-member team to release and update 20+ custom .NET service-oriented applications for company clients in health and insurance niches</w:t>
-            </w:r>
-          </w:p>
-          <w:p>
-            <w:pPr>
-              <w:numPr>
-                <w:ilvl w:val="0"/>
-                <w:numId w:val="3"/>
-              </w:numPr>
-              <w:spacing w:after="60"/>
-              <w:ind w:left="641" w:right="851" w:hanging="357"/>
-              <w:rPr>
-                <w:rFonts w:ascii="STIX Two Text" w:eastAsia="STIX Two Text" w:hAnsi="STIX Two Text" w:cs="STIX Two Text"/>
-                <w:i/>
-              </w:rPr>
-            </w:pPr>
-            <w:r>
-              <w:rPr>
-                <w:rFonts w:ascii="STIX Two Text" w:eastAsia="STIX Two Text" w:hAnsi="STIX Two Text" w:cs="STIX Two Text"/>
-              </w:rPr>
-              <w:t>Decreased software testing time by 15% by developing automated test scripts to alleviate testing bottleneck caused by large volume of tests</w:t>
-            </w:r>
-          </w:p>
-          <w:p>
-            <w:pPr>
-              <w:numPr>
-                <w:ilvl w:val="0"/>
-                <w:numId w:val="3"/>
-              </w:numPr>
-              <w:spacing w:after="60"/>
-              <w:ind w:left="641" w:right="851" w:hanging="357"/>
-              <w:rPr>
-                <w:rFonts w:ascii="STIX Two Text" w:eastAsia="STIX Two Text" w:hAnsi="STIX Two Text" w:cs="STIX Two Text"/>
-                <w:i/>
-              </w:rPr>
-            </w:pPr>
-            <w:r>
-              <w:rPr>
-                <w:rFonts w:ascii="STIX Two Text" w:eastAsia="STIX Two Text" w:hAnsi="STIX Two Text" w:cs="STIX Two Text"/>
-              </w:rPr>
-              <w:t>Create, test, and deploy applications on custom hardware</w:t>
-            </w:r>
-          </w:p>
-          <w:p>
-            <w:pPr>
-              <w:numPr>
-                <w:ilvl w:val="0"/>
-                <w:numId w:val="3"/>
-              </w:numPr>
-              <w:spacing w:after="60"/>
-              <w:ind w:left="641" w:right="851" w:hanging="357"/>
-              <w:rPr>
-                <w:rFonts w:ascii="STIX Two Text" w:eastAsia="STIX Two Text" w:hAnsi="STIX Two Text" w:cs="STIX Two Text"/>
-                <w:i/>
-              </w:rPr>
-            </w:pPr>
-            <w:r>
-              <w:rPr>
-                <w:rFonts w:ascii="STIX Two Text" w:eastAsia="STIX Two Text" w:hAnsi="STIX Two Text" w:cs="STIX Two Text"/>
-              </w:rPr>
-              <w:t>Reduced loading time by 80% by refactoring student library website's legacy JavaScript codebase</w:t>
-            </w:r>
-          </w:p>
-        </w:tc>
-      </w:tr>
-      <w:tr>
-        <w:trPr>
-          <w:trHeight w:val="275"/>
-        </w:trPr>
-        <w:tc>
-          <w:tcPr>
-            <w:tcW w:w="11194" w:type="dxa"/>
-            <w:gridSpan w:val="4"/>
-          </w:tcPr>
-          <w:p>
-            <w:pPr>
-              <w:rPr>
-                <w:rFonts w:ascii="STIX Two Text" w:eastAsia="STIX Two Text" w:hAnsi="STIX Two Text" w:cs="STIX Two Text"/>
-                <w:sz w:val="16"/>
-                <w:szCs w:val="16"/>
-              </w:rPr>
-            </w:pPr>
-          </w:p>
-        </w:tc>
-      </w:tr>
-      <w:tr>
-        <w:trPr>
+          <w:gridBefore w:val="1"/>
+          <w:wBefore w:w="108" w:type="dxa"/>
           <w:trHeight w:val="371"/>
         </w:trPr>
         <w:tc>
           <w:tcPr>
-            <w:tcW w:w="11194" w:type="dxa"/>
-            <w:gridSpan w:val="4"/>
+            <w:tcW w:w="11193" w:type="dxa"/>
+            <w:gridSpan w:val="3"/>
             <w:tcBorders>
               <w:bottom w:val="nil"/>
             </w:tcBorders>
@@ -818,12 +1161,14 @@
       </w:tr>
       <w:tr>
         <w:trPr>
+          <w:gridBefore w:val="1"/>
+          <w:wBefore w:w="108" w:type="dxa"/>
           <w:trHeight w:val="228"/>
         </w:trPr>
         <w:tc>
           <w:tcPr>
-            <w:tcW w:w="11194" w:type="dxa"/>
-            <w:gridSpan w:val="4"/>
+            <w:tcW w:w="11193" w:type="dxa"/>
+            <w:gridSpan w:val="3"/>
             <w:tcBorders>
               <w:top w:val="nil"/>
             </w:tcBorders>
@@ -843,12 +1188,14 @@
       </w:tr>
       <w:tr>
         <w:trPr>
+          <w:gridBefore w:val="1"/>
+          <w:wBefore w:w="108" w:type="dxa"/>
           <w:trHeight w:val="371"/>
         </w:trPr>
         <w:tc>
           <w:tcPr>
-            <w:tcW w:w="11194" w:type="dxa"/>
-            <w:gridSpan w:val="4"/>
+            <w:tcW w:w="11193" w:type="dxa"/>
+            <w:gridSpan w:val="3"/>
           </w:tcPr>
           <w:p>
             <w:pPr>
@@ -872,6 +1219,7 @@
               <w:rPr>
                 <w:rFonts w:ascii="STIX Two Text" w:eastAsia="STIX Two Text" w:hAnsi="STIX Two Text" w:cs="STIX Two Text"/>
               </w:rPr>
+              <w:lastRenderedPageBreak/>
               <w:t>Microsoft 365, Visual Studio, Android Studio, NetBeans, and Eclipse</w:t>
             </w:r>
           </w:p>
@@ -904,12 +1252,14 @@
       </w:tr>
       <w:tr>
         <w:trPr>
+          <w:gridBefore w:val="1"/>
+          <w:wBefore w:w="108" w:type="dxa"/>
           <w:trHeight w:val="185"/>
         </w:trPr>
         <w:tc>
           <w:tcPr>
-            <w:tcW w:w="11194" w:type="dxa"/>
-            <w:gridSpan w:val="4"/>
+            <w:tcW w:w="11193" w:type="dxa"/>
+            <w:gridSpan w:val="3"/>
           </w:tcPr>
           <w:p>
             <w:pPr>
@@ -932,1039 +1282,6 @@
           </w:p>
         </w:tc>
       </w:tr>
-      <w:tr>
-        <w:trPr>
-          <w:trHeight w:val="371"/>
-        </w:trPr>
-        <w:tc>
-          <w:tcPr>
-            <w:tcW w:w="11194" w:type="dxa"/>
-            <w:gridSpan w:val="4"/>
-          </w:tcPr>
-          <w:p>
-            <w:pPr>
-              <w:rPr>
-                <w:rFonts w:ascii="STIX Two Text" w:eastAsia="STIX Two Text" w:hAnsi="STIX Two Text" w:cs="STIX Two Text"/>
-                <w:color w:val="000000"/>
-              </w:rPr>
-            </w:pPr>
-            <w:r>
-              <w:rPr>
-                <w:rFonts w:ascii="STIX Two Text" w:eastAsia="STIX Two Text" w:hAnsi="STIX Two Text" w:cs="STIX Two Text"/>
-                <w:b/>
-                <w:color w:val="1D3B62"/>
-                <w:sz w:val="24"/>
-                <w:szCs w:val="24"/>
-              </w:rPr>
-              <w:t>PROJECTS</w:t>
-            </w:r>
-          </w:p>
-        </w:tc>
-      </w:tr>
-      <w:tr>
-        <w:trPr>
-          <w:trHeight w:val="230"/>
-        </w:trPr>
-        <w:tc>
-          <w:tcPr>
-            <w:tcW w:w="11194" w:type="dxa"/>
-            <w:gridSpan w:val="4"/>
-          </w:tcPr>
-          <w:p>
-            <w:pPr>
-              <w:pBdr>
-                <w:top w:val="nil"/>
-                <w:left w:val="nil"/>
-                <w:bottom w:val="nil"/>
-                <w:right w:val="nil"/>
-                <w:between w:val="nil"/>
-              </w:pBdr>
-              <w:spacing w:after="60" w:line="259" w:lineRule="auto"/>
-              <w:ind w:left="641" w:hanging="357"/>
-              <w:rPr>
-                <w:rFonts w:ascii="STIX Two Text" w:eastAsia="STIX Two Text" w:hAnsi="STIX Two Text" w:cs="STIX Two Text"/>
-                <w:color w:val="000000"/>
-                <w:sz w:val="16"/>
-                <w:szCs w:val="16"/>
-              </w:rPr>
-            </w:pPr>
-          </w:p>
-        </w:tc>
-      </w:tr>
-      <w:tr>
-        <w:trPr>
-          <w:trHeight w:val="765"/>
-        </w:trPr>
-        <w:tc>
-          <w:tcPr>
-            <w:tcW w:w="8364" w:type="dxa"/>
-          </w:tcPr>
-          <w:p>
-            <w:pPr>
-              <w:spacing w:after="60"/>
-              <w:rPr>
-                <w:rFonts w:ascii="STIX Two Text" w:eastAsia="STIX Two Text" w:hAnsi="STIX Two Text" w:cs="STIX Two Text"/>
-                <w:b/>
-              </w:rPr>
-            </w:pPr>
-            <w:r>
-              <w:rPr>
-                <w:rFonts w:ascii="STIX Two Text" w:eastAsia="STIX Two Text" w:hAnsi="STIX Two Text" w:cs="STIX Two Text"/>
-                <w:b/>
-              </w:rPr>
-              <w:t>QUICKSILVER BOOKING</w:t>
-            </w:r>
-          </w:p>
-          <w:p>
-            <w:pPr>
-              <w:spacing w:after="60"/>
-              <w:rPr>
-                <w:rFonts w:ascii="STIX Two Text" w:eastAsia="STIX Two Text" w:hAnsi="STIX Two Text" w:cs="STIX Two Text"/>
-              </w:rPr>
-            </w:pPr>
-            <w:r>
-              <w:rPr>
-                <w:rFonts w:ascii="STIX Two Text" w:eastAsia="STIX Two Text" w:hAnsi="STIX Two Text" w:cs="STIX Two Text"/>
-              </w:rPr>
-              <w:t>Developer</w:t>
-            </w:r>
-          </w:p>
-        </w:tc>
-        <w:tc>
-          <w:tcPr>
-            <w:tcW w:w="2830" w:type="dxa"/>
-            <w:gridSpan w:val="3"/>
-          </w:tcPr>
-          <w:p>
-            <w:pPr>
-              <w:jc w:val="right"/>
-              <w:rPr>
-                <w:rFonts w:ascii="STIX Two Text" w:eastAsia="STIX Two Text" w:hAnsi="STIX Two Text" w:cs="STIX Two Text"/>
-                <w:i/>
-              </w:rPr>
-            </w:pPr>
-            <w:r>
-              <w:rPr>
-                <w:rFonts w:ascii="STIX Two Text" w:eastAsia="STIX Two Text" w:hAnsi="STIX Two Text" w:cs="STIX Two Text"/>
-                <w:b/>
-              </w:rPr>
-              <w:t>Austin, TX</w:t>
-            </w:r>
-            <w:r>
-              <w:rPr>
-                <w:rFonts w:ascii="STIX Two Text" w:eastAsia="STIX Two Text" w:hAnsi="STIX Two Text" w:cs="STIX Two Text"/>
-                <w:i/>
-              </w:rPr>
-              <w:t xml:space="preserve"> </w:t>
-            </w:r>
-          </w:p>
-          <w:p>
-            <w:pPr>
-              <w:jc w:val="right"/>
-              <w:rPr>
-                <w:rFonts w:ascii="STIX Two Text" w:eastAsia="STIX Two Text" w:hAnsi="STIX Two Text" w:cs="STIX Two Text"/>
-                <w:b/>
-                <w:i/>
-              </w:rPr>
-            </w:pPr>
-            <w:r>
-              <w:rPr>
-                <w:rFonts w:ascii="STIX Two Text" w:eastAsia="STIX Two Text" w:hAnsi="STIX Two Text" w:cs="STIX Two Text"/>
-                <w:i/>
-              </w:rPr>
-              <w:t>Jan 2022–June 2022</w:t>
-            </w:r>
-            <w:r>
-              <w:rPr>
-                <w:rFonts w:ascii="STIX Two Text" w:eastAsia="STIX Two Text" w:hAnsi="STIX Two Text" w:cs="STIX Two Text"/>
-                <w:b/>
-                <w:i/>
-              </w:rPr>
-              <w:t xml:space="preserve"> </w:t>
-            </w:r>
-          </w:p>
-        </w:tc>
-      </w:tr>
-      <w:tr>
-        <w:trPr>
-          <w:trHeight w:val="371"/>
-        </w:trPr>
-        <w:tc>
-          <w:tcPr>
-            <w:tcW w:w="11194" w:type="dxa"/>
-            <w:gridSpan w:val="4"/>
-          </w:tcPr>
-          <w:p>
-            <w:pPr>
-              <w:pBdr>
-                <w:top w:val="nil"/>
-                <w:left w:val="nil"/>
-                <w:bottom w:val="nil"/>
-                <w:right w:val="nil"/>
-                <w:between w:val="nil"/>
-              </w:pBdr>
-              <w:spacing w:after="60" w:line="259" w:lineRule="auto"/>
-              <w:rPr>
-                <w:rFonts w:ascii="STIX Two Text" w:eastAsia="STIX Two Text" w:hAnsi="STIX Two Text" w:cs="STIX Two Text"/>
-              </w:rPr>
-            </w:pPr>
-            <w:r>
-              <w:rPr>
-                <w:rFonts w:ascii="STIX Two Text" w:eastAsia="STIX Two Text" w:hAnsi="STIX Two Text" w:cs="STIX Two Text"/>
-                <w:b/>
-              </w:rPr>
-              <w:t>Description</w:t>
-            </w:r>
-            <w:r>
-              <w:rPr>
-                <w:rFonts w:ascii="STIX Two Text" w:eastAsia="STIX Two Text" w:hAnsi="STIX Two Text" w:cs="STIX Two Text"/>
-              </w:rPr>
-              <w:t xml:space="preserve">: A mobile hotel booking solution for iOS. Pulls and compares the best hotel prices in a geographical area. </w:t>
-            </w:r>
-            <w:r>
-              <w:rPr>
-                <w:rFonts w:ascii="STIX Two Text" w:eastAsia="STIX Two Text" w:hAnsi="STIX Two Text" w:cs="STIX Two Text"/>
-                <w:b/>
-              </w:rPr>
-              <w:t>Used</w:t>
-            </w:r>
-            <w:r>
-              <w:rPr>
-                <w:rFonts w:ascii="STIX Two Text" w:eastAsia="STIX Two Text" w:hAnsi="STIX Two Text" w:cs="STIX Two Text"/>
-              </w:rPr>
-              <w:t xml:space="preserve">: Swift, </w:t>
-            </w:r>
-            <w:proofErr w:type="spellStart"/>
-            <w:r>
-              <w:rPr>
-                <w:rFonts w:ascii="STIX Two Text" w:eastAsia="STIX Two Text" w:hAnsi="STIX Two Text" w:cs="STIX Two Text"/>
-              </w:rPr>
-              <w:t>Javascript</w:t>
-            </w:r>
-            <w:proofErr w:type="spellEnd"/>
-            <w:r>
-              <w:rPr>
-                <w:rFonts w:ascii="STIX Two Text" w:eastAsia="STIX Two Text" w:hAnsi="STIX Two Text" w:cs="STIX Two Text"/>
-              </w:rPr>
-              <w:t>, C++</w:t>
-            </w:r>
-          </w:p>
-          <w:p>
-            <w:pPr>
-              <w:numPr>
-                <w:ilvl w:val="0"/>
-                <w:numId w:val="2"/>
-              </w:numPr>
-              <w:pBdr>
-                <w:top w:val="nil"/>
-                <w:left w:val="nil"/>
-                <w:bottom w:val="nil"/>
-                <w:right w:val="nil"/>
-                <w:between w:val="nil"/>
-              </w:pBdr>
-              <w:spacing w:line="259" w:lineRule="auto"/>
-              <w:rPr>
-                <w:rFonts w:ascii="STIX Two Text" w:eastAsia="STIX Two Text" w:hAnsi="STIX Two Text" w:cs="STIX Two Text"/>
-              </w:rPr>
-            </w:pPr>
-            <w:r>
-              <w:rPr>
-                <w:rFonts w:ascii="STIX Two Text" w:eastAsia="STIX Two Text" w:hAnsi="STIX Two Text" w:cs="STIX Two Text"/>
-              </w:rPr>
-              <w:t>Worked across the development lifecycle to build and maintain code, eliminating 150 unique bugs</w:t>
-            </w:r>
-          </w:p>
-          <w:p>
-            <w:pPr>
-              <w:numPr>
-                <w:ilvl w:val="0"/>
-                <w:numId w:val="2"/>
-              </w:numPr>
-              <w:pBdr>
-                <w:top w:val="nil"/>
-                <w:left w:val="nil"/>
-                <w:bottom w:val="nil"/>
-                <w:right w:val="nil"/>
-                <w:between w:val="nil"/>
-              </w:pBdr>
-              <w:spacing w:line="259" w:lineRule="auto"/>
-              <w:rPr>
-                <w:rFonts w:ascii="STIX Two Text" w:eastAsia="STIX Two Text" w:hAnsi="STIX Two Text" w:cs="STIX Two Text"/>
-              </w:rPr>
-            </w:pPr>
-            <w:r>
-              <w:rPr>
-                <w:rFonts w:ascii="STIX Two Text" w:eastAsia="STIX Two Text" w:hAnsi="STIX Two Text" w:cs="STIX Two Text"/>
-              </w:rPr>
-              <w:t>Developed dynamic components for the app and created a new landing page that streamlined customer experience</w:t>
-            </w:r>
-          </w:p>
-          <w:p>
-            <w:pPr>
-              <w:numPr>
-                <w:ilvl w:val="0"/>
-                <w:numId w:val="2"/>
-              </w:numPr>
-              <w:pBdr>
-                <w:top w:val="nil"/>
-                <w:left w:val="nil"/>
-                <w:bottom w:val="nil"/>
-                <w:right w:val="nil"/>
-                <w:between w:val="nil"/>
-              </w:pBdr>
-              <w:spacing w:after="60" w:line="259" w:lineRule="auto"/>
-              <w:rPr>
-                <w:rFonts w:ascii="STIX Two Text" w:eastAsia="STIX Two Text" w:hAnsi="STIX Two Text" w:cs="STIX Two Text"/>
-              </w:rPr>
-            </w:pPr>
-            <w:r>
-              <w:rPr>
-                <w:rFonts w:ascii="STIX Two Text" w:eastAsia="STIX Two Text" w:hAnsi="STIX Two Text" w:cs="STIX Two Text"/>
-              </w:rPr>
-              <w:t>Built a new feature using Swift to automatically compare competing discount offers</w:t>
-            </w:r>
-          </w:p>
-        </w:tc>
-      </w:tr>
-      <w:tr>
-        <w:trPr>
-          <w:gridAfter w:val="1"/>
-          <w:wAfter w:w="98" w:type="dxa"/>
-        </w:trPr>
-        <w:tc>
-          <w:tcPr>
-            <w:tcW w:w="11096" w:type="dxa"/>
-            <w:gridSpan w:val="3"/>
-            <w:tcBorders>
-              <w:top w:val="nil"/>
-              <w:left w:val="nil"/>
-              <w:bottom w:val="nil"/>
-              <w:right w:val="nil"/>
-            </w:tcBorders>
-            <w:tcMar>
-              <w:top w:w="1134" w:type="dxa"/>
-              <w:left w:w="1134" w:type="dxa"/>
-              <w:bottom w:w="567" w:type="dxa"/>
-              <w:right w:w="1134" w:type="dxa"/>
-            </w:tcMar>
-            <w:vAlign w:val="center"/>
-          </w:tcPr>
-          <w:p>
-            <w:pPr>
-              <w:jc w:val="right"/>
-              <w:rPr>
-                <w:rFonts w:ascii="Poppins" w:eastAsia="Poppins" w:hAnsi="Poppins" w:cs="Poppins"/>
-              </w:rPr>
-            </w:pPr>
-            <w:r>
-              <w:rPr>
-                <w:rFonts w:ascii="Noto Sans" w:eastAsia="Noto Sans" w:hAnsi="Noto Sans" w:cs="Noto Sans"/>
-                <w:b/>
-                <w:noProof/>
-                <w:sz w:val="48"/>
-                <w:szCs w:val="48"/>
-              </w:rPr>
-              <w:lastRenderedPageBreak/>
-              <w:drawing>
-                <wp:inline distT="0" distB="0" distL="0" distR="0" wp14:anchorId="161BCC4A" wp14:editId="4378E7B5">
-                  <wp:extent cx="1530040" cy="178505"/>
-                  <wp:effectExtent l="0" t="0" r="0" b="0"/>
-                  <wp:docPr id="5" name="image2.png" descr="Logo&#10;&#10;Description automatically generated"/>
-                  <wp:cNvGraphicFramePr/>
-                  <a:graphic xmlns:a="http://schemas.openxmlformats.org/drawingml/2006/main">
-                    <a:graphicData uri="http://schemas.openxmlformats.org/drawingml/2006/picture">
-                      <pic:pic xmlns:pic="http://schemas.openxmlformats.org/drawingml/2006/picture">
-                        <pic:nvPicPr>
-                          <pic:cNvPr id="0" name="image2.png" descr="Logo&#10;&#10;Description automatically generated"/>
-                          <pic:cNvPicPr preferRelativeResize="0"/>
-                        </pic:nvPicPr>
-                        <pic:blipFill>
-                          <a:blip r:embed="rId8"/>
-                          <a:srcRect/>
-                          <a:stretch>
-                            <a:fillRect/>
-                          </a:stretch>
-                        </pic:blipFill>
-                        <pic:spPr>
-                          <a:xfrm>
-                            <a:off x="0" y="0"/>
-                            <a:ext cx="1530040" cy="178505"/>
-                          </a:xfrm>
-                          <a:prstGeom prst="rect">
-                            <a:avLst/>
-                          </a:prstGeom>
-                          <a:ln/>
-                        </pic:spPr>
-                      </pic:pic>
-                    </a:graphicData>
-                  </a:graphic>
-                </wp:inline>
-              </w:drawing>
-            </w:r>
-          </w:p>
-          <w:p>
-            <w:pPr>
-              <w:rPr>
-                <w:rFonts w:ascii="Poppins" w:eastAsia="Poppins" w:hAnsi="Poppins" w:cs="Poppins"/>
-                <w:b/>
-                <w:sz w:val="40"/>
-                <w:szCs w:val="40"/>
-              </w:rPr>
-            </w:pPr>
-          </w:p>
-          <w:p>
-            <w:pPr>
-              <w:rPr>
-                <w:rFonts w:ascii="Poppins" w:eastAsia="Poppins" w:hAnsi="Poppins" w:cs="Poppins"/>
-                <w:b/>
-                <w:sz w:val="40"/>
-                <w:szCs w:val="40"/>
-              </w:rPr>
-            </w:pPr>
-            <w:r>
-              <w:rPr>
-                <w:rFonts w:ascii="Poppins" w:eastAsia="Poppins" w:hAnsi="Poppins" w:cs="Poppins"/>
-                <w:b/>
-                <w:sz w:val="40"/>
-                <w:szCs w:val="40"/>
-              </w:rPr>
-              <w:t>Dear Job Seeker,</w:t>
-            </w:r>
-          </w:p>
-          <w:p>
-            <w:pPr>
-              <w:rPr>
-                <w:rFonts w:ascii="Poppins" w:eastAsia="Poppins" w:hAnsi="Poppins" w:cs="Poppins"/>
-              </w:rPr>
-            </w:pPr>
-          </w:p>
-          <w:p>
-            <w:pPr>
-              <w:pBdr>
-                <w:top w:val="nil"/>
-                <w:left w:val="nil"/>
-                <w:bottom w:val="nil"/>
-                <w:right w:val="nil"/>
-                <w:between w:val="nil"/>
-              </w:pBdr>
-              <w:ind w:left="720"/>
-              <w:rPr>
-                <w:rFonts w:ascii="Poppins" w:eastAsia="Poppins" w:hAnsi="Poppins" w:cs="Poppins"/>
-                <w:color w:val="000000"/>
-                <w:sz w:val="20"/>
-                <w:szCs w:val="20"/>
-              </w:rPr>
-            </w:pPr>
-            <w:r>
-              <w:rPr>
-                <w:rFonts w:ascii="Poppins" w:eastAsia="Poppins" w:hAnsi="Poppins" w:cs="Poppins"/>
-                <w:color w:val="000000"/>
-                <w:sz w:val="20"/>
-                <w:szCs w:val="20"/>
-              </w:rPr>
-              <w:t>Inspired by the architecture of its namesake city, the “Chicago” resume template is bold and professional.</w:t>
-            </w:r>
-          </w:p>
-          <w:p>
-            <w:pPr>
-              <w:pBdr>
-                <w:top w:val="nil"/>
-                <w:left w:val="nil"/>
-                <w:bottom w:val="nil"/>
-                <w:right w:val="nil"/>
-                <w:between w:val="nil"/>
-              </w:pBdr>
-              <w:ind w:left="720"/>
-              <w:rPr>
-                <w:rFonts w:ascii="Poppins" w:eastAsia="Poppins" w:hAnsi="Poppins" w:cs="Poppins"/>
-                <w:color w:val="000000"/>
-                <w:sz w:val="20"/>
-                <w:szCs w:val="20"/>
-              </w:rPr>
-            </w:pPr>
-            <w:r>
-              <w:rPr>
-                <w:rFonts w:ascii="Poppins" w:eastAsia="Poppins" w:hAnsi="Poppins" w:cs="Poppins"/>
-                <w:color w:val="000000"/>
-                <w:sz w:val="20"/>
-                <w:szCs w:val="20"/>
-              </w:rPr>
-              <w:t> </w:t>
-            </w:r>
-          </w:p>
-          <w:p>
-            <w:pPr>
-              <w:pBdr>
-                <w:top w:val="nil"/>
-                <w:left w:val="nil"/>
-                <w:bottom w:val="nil"/>
-                <w:right w:val="nil"/>
-                <w:between w:val="nil"/>
-              </w:pBdr>
-              <w:ind w:left="720"/>
-              <w:rPr>
-                <w:rFonts w:ascii="Poppins" w:eastAsia="Poppins" w:hAnsi="Poppins" w:cs="Poppins"/>
-                <w:color w:val="000000"/>
-                <w:sz w:val="20"/>
-                <w:szCs w:val="20"/>
-              </w:rPr>
-            </w:pPr>
-            <w:r>
-              <w:rPr>
-                <w:rFonts w:ascii="Poppins" w:eastAsia="Poppins" w:hAnsi="Poppins" w:cs="Poppins"/>
-                <w:color w:val="000000"/>
-                <w:sz w:val="20"/>
-                <w:szCs w:val="20"/>
-              </w:rPr>
-              <w:t>Featuring an easy-to-read serif font and full-width horizontal lines to help break up information, this template is perfect for job seekers in formal industries. </w:t>
-            </w:r>
-          </w:p>
-          <w:p>
-            <w:pPr>
-              <w:pBdr>
-                <w:top w:val="nil"/>
-                <w:left w:val="nil"/>
-                <w:bottom w:val="nil"/>
-                <w:right w:val="nil"/>
-                <w:between w:val="nil"/>
-              </w:pBdr>
-              <w:ind w:left="720"/>
-              <w:rPr>
-                <w:rFonts w:ascii="Poppins" w:eastAsia="Poppins" w:hAnsi="Poppins" w:cs="Poppins"/>
-                <w:color w:val="000000"/>
-                <w:sz w:val="20"/>
-                <w:szCs w:val="20"/>
-              </w:rPr>
-            </w:pPr>
-            <w:r>
-              <w:rPr>
-                <w:rFonts w:ascii="Poppins" w:eastAsia="Poppins" w:hAnsi="Poppins" w:cs="Poppins"/>
-                <w:color w:val="000000"/>
-                <w:sz w:val="20"/>
-                <w:szCs w:val="20"/>
-              </w:rPr>
-              <w:t> </w:t>
-            </w:r>
-          </w:p>
-          <w:p>
-            <w:pPr>
-              <w:pBdr>
-                <w:top w:val="nil"/>
-                <w:left w:val="nil"/>
-                <w:bottom w:val="nil"/>
-                <w:right w:val="nil"/>
-                <w:between w:val="nil"/>
-              </w:pBdr>
-              <w:ind w:left="720"/>
-              <w:rPr>
-                <w:rFonts w:ascii="Poppins" w:eastAsia="Poppins" w:hAnsi="Poppins" w:cs="Poppins"/>
-                <w:color w:val="000000"/>
-                <w:sz w:val="20"/>
-                <w:szCs w:val="20"/>
-              </w:rPr>
-            </w:pPr>
-            <w:r>
-              <w:rPr>
-                <w:rFonts w:ascii="Poppins" w:eastAsia="Poppins" w:hAnsi="Poppins" w:cs="Poppins"/>
-                <w:color w:val="000000"/>
-                <w:sz w:val="20"/>
-                <w:szCs w:val="20"/>
-              </w:rPr>
-              <w:t xml:space="preserve">We recommend using the “Chicago” resume template if you’re building a career in </w:t>
-            </w:r>
-            <w:hyperlink r:id="rId9">
-              <w:r>
-                <w:rPr>
-                  <w:rFonts w:ascii="Poppins" w:eastAsia="Poppins" w:hAnsi="Poppins" w:cs="Poppins"/>
-                  <w:color w:val="F07855"/>
-                  <w:sz w:val="20"/>
-                  <w:szCs w:val="20"/>
-                </w:rPr>
-                <w:t>investment banking</w:t>
-              </w:r>
-            </w:hyperlink>
-            <w:r>
-              <w:rPr>
-                <w:rFonts w:ascii="Poppins" w:eastAsia="Poppins" w:hAnsi="Poppins" w:cs="Poppins"/>
-                <w:color w:val="000000"/>
-                <w:sz w:val="20"/>
-                <w:szCs w:val="20"/>
-              </w:rPr>
-              <w:t xml:space="preserve"> or </w:t>
-            </w:r>
-            <w:hyperlink r:id="rId10">
-              <w:r>
-                <w:rPr>
-                  <w:rFonts w:ascii="Poppins" w:eastAsia="Poppins" w:hAnsi="Poppins" w:cs="Poppins"/>
-                  <w:color w:val="F07855"/>
-                  <w:sz w:val="20"/>
-                  <w:szCs w:val="20"/>
-                </w:rPr>
-                <w:t>consulting</w:t>
-              </w:r>
-            </w:hyperlink>
-            <w:r>
-              <w:rPr>
-                <w:rFonts w:ascii="Poppins" w:eastAsia="Poppins" w:hAnsi="Poppins" w:cs="Poppins"/>
-                <w:color w:val="000000"/>
-                <w:sz w:val="20"/>
-                <w:szCs w:val="20"/>
-              </w:rPr>
-              <w:t>.</w:t>
-            </w:r>
-          </w:p>
-          <w:p>
-            <w:pPr>
-              <w:ind w:right="571"/>
-              <w:rPr>
-                <w:rFonts w:ascii="Poppins" w:eastAsia="Poppins" w:hAnsi="Poppins" w:cs="Poppins"/>
-                <w:sz w:val="20"/>
-                <w:szCs w:val="20"/>
-              </w:rPr>
-            </w:pPr>
-          </w:p>
-          <w:p>
-            <w:pPr>
-              <w:ind w:left="709" w:right="573"/>
-              <w:rPr>
-                <w:rFonts w:ascii="Poppins" w:eastAsia="Poppins" w:hAnsi="Poppins" w:cs="Poppins"/>
-                <w:sz w:val="20"/>
-                <w:szCs w:val="20"/>
-              </w:rPr>
-            </w:pPr>
-            <w:r>
-              <w:rPr>
-                <w:rFonts w:ascii="Poppins" w:eastAsia="Poppins" w:hAnsi="Poppins" w:cs="Poppins"/>
-                <w:sz w:val="20"/>
-                <w:szCs w:val="20"/>
-              </w:rPr>
-              <w:t>If you’re still struggling to write your resume, here are some free resources to help you put together a resume that shows employers you’re the right person for the job:</w:t>
-            </w:r>
-          </w:p>
-          <w:p>
-            <w:pPr>
-              <w:ind w:left="709" w:right="571"/>
-              <w:rPr>
-                <w:rFonts w:ascii="Poppins" w:eastAsia="Poppins" w:hAnsi="Poppins" w:cs="Poppins"/>
-                <w:sz w:val="20"/>
-                <w:szCs w:val="20"/>
-              </w:rPr>
-            </w:pPr>
-            <w:r>
-              <w:rPr>
-                <w:rFonts w:ascii="Poppins" w:eastAsia="Poppins" w:hAnsi="Poppins" w:cs="Poppins"/>
-                <w:sz w:val="20"/>
-                <w:szCs w:val="20"/>
-              </w:rPr>
-              <w:t>·     </w:t>
-            </w:r>
-            <w:hyperlink r:id="rId11">
-              <w:r>
-                <w:rPr>
-                  <w:rFonts w:ascii="Poppins" w:eastAsia="Poppins" w:hAnsi="Poppins" w:cs="Poppins"/>
-                  <w:color w:val="EF7855"/>
-                  <w:sz w:val="20"/>
-                  <w:szCs w:val="20"/>
-                </w:rPr>
-                <w:t>Free Resume Builder</w:t>
-              </w:r>
-            </w:hyperlink>
-          </w:p>
-          <w:p>
-            <w:pPr>
-              <w:ind w:left="709" w:right="571"/>
-              <w:rPr>
-                <w:rFonts w:ascii="Poppins" w:eastAsia="Poppins" w:hAnsi="Poppins" w:cs="Poppins"/>
-                <w:sz w:val="20"/>
-                <w:szCs w:val="20"/>
-              </w:rPr>
-            </w:pPr>
-            <w:r>
-              <w:rPr>
-                <w:rFonts w:ascii="Poppins" w:eastAsia="Poppins" w:hAnsi="Poppins" w:cs="Poppins"/>
-                <w:sz w:val="20"/>
-                <w:szCs w:val="20"/>
-              </w:rPr>
-              <w:t>·     How to Write a Resume</w:t>
-            </w:r>
-          </w:p>
-          <w:p>
-            <w:pPr>
-              <w:ind w:left="709" w:right="571"/>
-              <w:rPr>
-                <w:rFonts w:ascii="Poppins" w:eastAsia="Poppins" w:hAnsi="Poppins" w:cs="Poppins"/>
-                <w:color w:val="EF7855"/>
-                <w:sz w:val="20"/>
-                <w:szCs w:val="20"/>
-              </w:rPr>
-            </w:pPr>
-            <w:r>
-              <w:rPr>
-                <w:rFonts w:ascii="Poppins" w:eastAsia="Poppins" w:hAnsi="Poppins" w:cs="Poppins"/>
-                <w:sz w:val="20"/>
-                <w:szCs w:val="20"/>
-              </w:rPr>
-              <w:t>·     </w:t>
-            </w:r>
-            <w:r>
-              <w:fldChar w:fldCharType="begin"/>
-            </w:r>
-            <w:r>
-              <w:instrText xml:space="preserve"> HYPERLINK "https://resumegenius.com/resume-samples?utm_source=Word_Doc&amp;utm_medium=Resume_Samples_Link&amp;utm_campaign=RG_Downloads" </w:instrText>
-            </w:r>
-            <w:r>
-              <w:fldChar w:fldCharType="separate"/>
-            </w:r>
-            <w:r>
-              <w:rPr>
-                <w:rFonts w:ascii="Poppins" w:eastAsia="Poppins" w:hAnsi="Poppins" w:cs="Poppins"/>
-                <w:color w:val="EF7855"/>
-                <w:sz w:val="20"/>
-                <w:szCs w:val="20"/>
-              </w:rPr>
-              <w:t>Resume Samples by Industry</w:t>
-            </w:r>
-          </w:p>
-          <w:p>
-            <w:pPr>
-              <w:ind w:left="709" w:right="571"/>
-              <w:rPr>
-                <w:rFonts w:ascii="Poppins" w:eastAsia="Poppins" w:hAnsi="Poppins" w:cs="Poppins"/>
-                <w:sz w:val="20"/>
-                <w:szCs w:val="20"/>
-              </w:rPr>
-            </w:pPr>
-            <w:r>
-              <w:fldChar w:fldCharType="end"/>
-            </w:r>
-          </w:p>
-          <w:p>
-            <w:pPr>
-              <w:ind w:left="709" w:right="573"/>
-              <w:rPr>
-                <w:rFonts w:ascii="Poppins" w:eastAsia="Poppins" w:hAnsi="Poppins" w:cs="Poppins"/>
-                <w:sz w:val="20"/>
-                <w:szCs w:val="20"/>
-              </w:rPr>
-            </w:pPr>
-            <w:r>
-              <w:rPr>
-                <w:rFonts w:ascii="Poppins" w:eastAsia="Poppins" w:hAnsi="Poppins" w:cs="Poppins"/>
-                <w:sz w:val="20"/>
-                <w:szCs w:val="20"/>
-              </w:rPr>
-              <w:t>Once you have a great resume, pair it with a convincing cover letter using our matching </w:t>
-            </w:r>
-            <w:hyperlink r:id="rId12" w:anchor="2021">
-              <w:r>
-                <w:rPr>
-                  <w:rFonts w:ascii="Poppins" w:eastAsia="Poppins" w:hAnsi="Poppins" w:cs="Poppins"/>
-                  <w:color w:val="EF7855"/>
-                  <w:sz w:val="20"/>
-                  <w:szCs w:val="20"/>
-                </w:rPr>
-                <w:t>2022 cover letter template</w:t>
-              </w:r>
-            </w:hyperlink>
-            <w:r>
-              <w:rPr>
-                <w:rFonts w:ascii="Poppins" w:eastAsia="Poppins" w:hAnsi="Poppins" w:cs="Poppins"/>
-                <w:sz w:val="20"/>
-                <w:szCs w:val="20"/>
-              </w:rPr>
-              <w:t>. Here are a few resources to help you write a cover letter that gives your application the boost it needs to land you an interview:</w:t>
-            </w:r>
-          </w:p>
-          <w:p>
-            <w:pPr>
-              <w:ind w:left="709" w:right="571"/>
-              <w:rPr>
-                <w:rFonts w:ascii="Poppins" w:eastAsia="Poppins" w:hAnsi="Poppins" w:cs="Poppins"/>
-                <w:sz w:val="20"/>
-                <w:szCs w:val="20"/>
-              </w:rPr>
-            </w:pPr>
-            <w:r>
-              <w:rPr>
-                <w:rFonts w:ascii="Poppins" w:eastAsia="Poppins" w:hAnsi="Poppins" w:cs="Poppins"/>
-                <w:sz w:val="20"/>
-                <w:szCs w:val="20"/>
-              </w:rPr>
-              <w:t>·     </w:t>
-            </w:r>
-            <w:hyperlink r:id="rId13">
-              <w:r>
-                <w:rPr>
-                  <w:rFonts w:ascii="Poppins" w:eastAsia="Poppins" w:hAnsi="Poppins" w:cs="Poppins"/>
-                  <w:color w:val="EF7855"/>
-                  <w:sz w:val="20"/>
-                  <w:szCs w:val="20"/>
-                </w:rPr>
-                <w:t>Cover Letter Builder</w:t>
-              </w:r>
-            </w:hyperlink>
-          </w:p>
-          <w:p>
-            <w:pPr>
-              <w:ind w:left="709" w:right="571"/>
-              <w:rPr>
-                <w:rFonts w:ascii="Poppins" w:eastAsia="Poppins" w:hAnsi="Poppins" w:cs="Poppins"/>
-                <w:sz w:val="20"/>
-                <w:szCs w:val="20"/>
-              </w:rPr>
-            </w:pPr>
-            <w:r>
-              <w:rPr>
-                <w:rFonts w:ascii="Poppins" w:eastAsia="Poppins" w:hAnsi="Poppins" w:cs="Poppins"/>
-                <w:sz w:val="20"/>
-                <w:szCs w:val="20"/>
-              </w:rPr>
-              <w:t>·     </w:t>
-            </w:r>
-            <w:hyperlink r:id="rId14">
-              <w:r>
-                <w:rPr>
-                  <w:rFonts w:ascii="Poppins" w:eastAsia="Poppins" w:hAnsi="Poppins" w:cs="Poppins"/>
-                  <w:color w:val="EF7855"/>
-                  <w:sz w:val="20"/>
-                  <w:szCs w:val="20"/>
-                </w:rPr>
-                <w:t>How to Write a Cover Letter</w:t>
-              </w:r>
-            </w:hyperlink>
-          </w:p>
-          <w:p>
-            <w:pPr>
-              <w:ind w:left="709" w:right="571"/>
-              <w:rPr>
-                <w:rFonts w:ascii="Poppins" w:eastAsia="Poppins" w:hAnsi="Poppins" w:cs="Poppins"/>
-                <w:color w:val="EF7855"/>
-                <w:sz w:val="20"/>
-                <w:szCs w:val="20"/>
-              </w:rPr>
-            </w:pPr>
-            <w:r>
-              <w:rPr>
-                <w:rFonts w:ascii="Poppins" w:eastAsia="Poppins" w:hAnsi="Poppins" w:cs="Poppins"/>
-                <w:sz w:val="20"/>
-                <w:szCs w:val="20"/>
-              </w:rPr>
-              <w:t>·     </w:t>
-            </w:r>
-            <w:hyperlink r:id="rId15">
-              <w:r>
-                <w:rPr>
-                  <w:rFonts w:ascii="Poppins" w:eastAsia="Poppins" w:hAnsi="Poppins" w:cs="Poppins"/>
-                  <w:color w:val="EF7855"/>
-                  <w:sz w:val="20"/>
-                  <w:szCs w:val="20"/>
-                </w:rPr>
-                <w:t>Cover Letter Examples by Industry</w:t>
-              </w:r>
-            </w:hyperlink>
-          </w:p>
-          <w:p>
-            <w:pPr>
-              <w:ind w:left="709" w:right="571"/>
-              <w:rPr>
-                <w:rFonts w:ascii="Poppins" w:eastAsia="Poppins" w:hAnsi="Poppins" w:cs="Poppins"/>
-                <w:color w:val="EF7855"/>
-                <w:sz w:val="20"/>
-                <w:szCs w:val="20"/>
-              </w:rPr>
-            </w:pPr>
-          </w:p>
-          <w:p>
-            <w:pPr>
-              <w:ind w:left="709" w:right="571"/>
-              <w:rPr>
-                <w:rFonts w:ascii="Poppins" w:eastAsia="Poppins" w:hAnsi="Poppins" w:cs="Poppins"/>
-                <w:color w:val="EF7855"/>
-                <w:sz w:val="20"/>
-                <w:szCs w:val="20"/>
-              </w:rPr>
-            </w:pPr>
-          </w:p>
-          <w:p>
-            <w:pPr>
-              <w:ind w:left="709" w:right="571"/>
-              <w:rPr>
-                <w:rFonts w:ascii="Poppins" w:eastAsia="Poppins" w:hAnsi="Poppins" w:cs="Poppins"/>
-                <w:color w:val="EF7855"/>
-                <w:sz w:val="20"/>
-                <w:szCs w:val="20"/>
-              </w:rPr>
-            </w:pPr>
-          </w:p>
-          <w:p>
-            <w:pPr>
-              <w:ind w:left="709" w:right="571"/>
-              <w:rPr>
-                <w:rFonts w:ascii="Poppins" w:eastAsia="Poppins" w:hAnsi="Poppins" w:cs="Poppins"/>
-                <w:color w:val="000000"/>
-                <w:sz w:val="20"/>
-                <w:szCs w:val="20"/>
-              </w:rPr>
-            </w:pPr>
-            <w:r>
-              <w:rPr>
-                <w:rFonts w:ascii="Poppins" w:eastAsia="Poppins" w:hAnsi="Poppins" w:cs="Poppins"/>
-                <w:color w:val="000000"/>
-                <w:sz w:val="20"/>
-                <w:szCs w:val="20"/>
-              </w:rPr>
-              <w:t xml:space="preserve">Best regards, </w:t>
-            </w:r>
-          </w:p>
-          <w:p>
-            <w:pPr>
-              <w:ind w:left="709" w:right="571"/>
-              <w:rPr>
-                <w:rFonts w:ascii="Poppins" w:eastAsia="Poppins" w:hAnsi="Poppins" w:cs="Poppins"/>
-                <w:color w:val="000000"/>
-                <w:sz w:val="20"/>
-                <w:szCs w:val="20"/>
-              </w:rPr>
-            </w:pPr>
-          </w:p>
-          <w:p>
-            <w:pPr>
-              <w:ind w:left="709" w:right="571"/>
-              <w:rPr>
-                <w:rFonts w:ascii="Poppins" w:eastAsia="Poppins" w:hAnsi="Poppins" w:cs="Poppins"/>
-                <w:sz w:val="20"/>
-                <w:szCs w:val="20"/>
-              </w:rPr>
-            </w:pPr>
-            <w:r>
-              <w:rPr>
-                <w:rFonts w:ascii="Poppins" w:eastAsia="Poppins" w:hAnsi="Poppins" w:cs="Poppins"/>
-                <w:noProof/>
-                <w:sz w:val="20"/>
-                <w:szCs w:val="20"/>
-              </w:rPr>
-              <w:drawing>
-                <wp:inline distT="0" distB="0" distL="0" distR="0" wp14:anchorId="105DE6C5" wp14:editId="7D6AC923">
-                  <wp:extent cx="3119865" cy="463346"/>
-                  <wp:effectExtent l="0" t="0" r="0" b="0"/>
-                  <wp:docPr id="6" name="image1.png" descr="Shape&#10;&#10;Description automatically generated with medium confidence"/>
-                  <wp:cNvGraphicFramePr/>
-                  <a:graphic xmlns:a="http://schemas.openxmlformats.org/drawingml/2006/main">
-                    <a:graphicData uri="http://schemas.openxmlformats.org/drawingml/2006/picture">
-                      <pic:pic xmlns:pic="http://schemas.openxmlformats.org/drawingml/2006/picture">
-                        <pic:nvPicPr>
-                          <pic:cNvPr id="0" name="image1.png" descr="Shape&#10;&#10;Description automatically generated with medium confidence"/>
-                          <pic:cNvPicPr preferRelativeResize="0"/>
-                        </pic:nvPicPr>
-                        <pic:blipFill>
-                          <a:blip r:embed="rId16"/>
-                          <a:srcRect/>
-                          <a:stretch>
-                            <a:fillRect/>
-                          </a:stretch>
-                        </pic:blipFill>
-                        <pic:spPr>
-                          <a:xfrm>
-                            <a:off x="0" y="0"/>
-                            <a:ext cx="3119865" cy="463346"/>
-                          </a:xfrm>
-                          <a:prstGeom prst="rect">
-                            <a:avLst/>
-                          </a:prstGeom>
-                          <a:ln/>
-                        </pic:spPr>
-                      </pic:pic>
-                    </a:graphicData>
-                  </a:graphic>
-                </wp:inline>
-              </w:drawing>
-            </w:r>
-          </w:p>
-          <w:p>
-            <w:pPr>
-              <w:ind w:right="573"/>
-              <w:rPr>
-                <w:rFonts w:ascii="Poppins" w:eastAsia="Poppins" w:hAnsi="Poppins" w:cs="Poppins"/>
-                <w:b/>
-                <w:sz w:val="16"/>
-                <w:szCs w:val="16"/>
-              </w:rPr>
-            </w:pPr>
-          </w:p>
-          <w:p>
-            <w:pPr>
-              <w:ind w:right="573"/>
-              <w:rPr>
-                <w:rFonts w:ascii="Poppins" w:eastAsia="Poppins" w:hAnsi="Poppins" w:cs="Poppins"/>
-                <w:b/>
-                <w:sz w:val="16"/>
-                <w:szCs w:val="16"/>
-              </w:rPr>
-            </w:pPr>
-          </w:p>
-          <w:p>
-            <w:pPr>
-              <w:ind w:right="573"/>
-              <w:rPr>
-                <w:rFonts w:ascii="Poppins" w:eastAsia="Poppins" w:hAnsi="Poppins" w:cs="Poppins"/>
-                <w:b/>
-                <w:sz w:val="16"/>
-                <w:szCs w:val="16"/>
-              </w:rPr>
-            </w:pPr>
-          </w:p>
-          <w:p>
-            <w:pPr>
-              <w:ind w:right="573"/>
-              <w:rPr>
-                <w:rFonts w:ascii="Poppins" w:eastAsia="Poppins" w:hAnsi="Poppins" w:cs="Poppins"/>
-                <w:b/>
-                <w:sz w:val="16"/>
-                <w:szCs w:val="16"/>
-              </w:rPr>
-            </w:pPr>
-          </w:p>
-          <w:p>
-            <w:pPr>
-              <w:ind w:right="573"/>
-              <w:rPr>
-                <w:rFonts w:ascii="Poppins" w:eastAsia="Poppins" w:hAnsi="Poppins" w:cs="Poppins"/>
-                <w:b/>
-                <w:sz w:val="16"/>
-                <w:szCs w:val="16"/>
-              </w:rPr>
-            </w:pPr>
-          </w:p>
-          <w:p>
-            <w:r>
-              <w:rPr>
-                <w:rFonts w:ascii="Poppins" w:eastAsia="Poppins" w:hAnsi="Poppins" w:cs="Poppins"/>
-                <w:b/>
-                <w:sz w:val="16"/>
-                <w:szCs w:val="16"/>
-              </w:rPr>
-              <w:t>IMPORTANT:</w:t>
-            </w:r>
-            <w:r>
-              <w:rPr>
-                <w:rFonts w:ascii="Poppins" w:eastAsia="Poppins" w:hAnsi="Poppins" w:cs="Poppins"/>
-                <w:sz w:val="16"/>
-                <w:szCs w:val="16"/>
-              </w:rPr>
-              <w:t xml:space="preserve"> </w:t>
-            </w:r>
-            <w:r>
-              <w:rPr>
-                <w:rFonts w:ascii="Poppins" w:eastAsia="Poppins" w:hAnsi="Poppins" w:cs="Poppins"/>
-                <w:color w:val="939DA5"/>
-                <w:sz w:val="16"/>
-                <w:szCs w:val="16"/>
-              </w:rPr>
-              <w:t>To delete the second page, right-click on the page and click “Delete Rows”</w:t>
-            </w:r>
-          </w:p>
-        </w:tc>
-      </w:tr>
     </w:tbl>
     <w:p>
       <w:pPr>
@@ -1975,13 +1292,31 @@
         </w:rPr>
       </w:pPr>
     </w:p>
+    <w:p>
+      <w:pPr>
+        <w:rPr>
+          <w:rFonts w:ascii="Poppins" w:eastAsia="Poppins" w:hAnsi="Poppins" w:cs="Poppins"/>
+          <w:sz w:val="2"/>
+          <w:szCs w:val="2"/>
+        </w:rPr>
+      </w:pPr>
+    </w:p>
+    <w:p>
+      <w:pPr>
+        <w:rPr>
+          <w:rFonts w:ascii="Poppins" w:eastAsia="Poppins" w:hAnsi="Poppins" w:cs="Poppins"/>
+          <w:sz w:val="2"/>
+          <w:szCs w:val="2"/>
+        </w:rPr>
+      </w:pPr>
+    </w:p>
     <w:sectPr>
-      <w:headerReference w:type="even" r:id="rId17"/>
-      <w:headerReference w:type="default" r:id="rId18"/>
-      <w:footerReference w:type="even" r:id="rId19"/>
-      <w:footerReference w:type="default" r:id="rId20"/>
-      <w:headerReference w:type="first" r:id="rId21"/>
-      <w:footerReference w:type="first" r:id="rId22"/>
+      <w:headerReference w:type="even" r:id="rId8"/>
+      <w:headerReference w:type="default" r:id="rId9"/>
+      <w:footerReference w:type="even" r:id="rId10"/>
+      <w:footerReference w:type="default" r:id="rId11"/>
+      <w:headerReference w:type="first" r:id="rId12"/>
+      <w:footerReference w:type="first" r:id="rId13"/>
       <w:pgSz w:w="12240" w:h="15840"/>
       <w:pgMar w:top="567" w:right="567" w:bottom="284" w:left="567" w:header="0" w:footer="0" w:gutter="0"/>
       <w:pgNumType w:start="1"/>
@@ -1992,7 +1327,7 @@
 </file>
 
 <file path=word/endnotes.xml><?xml version="1.0" encoding="utf-8"?>
-<w:endnotes xmlns:wpc="http://schemas.microsoft.com/office/word/2010/wordprocessingCanvas" xmlns:cx="http://schemas.microsoft.com/office/drawing/2014/chartex" xmlns:cx1="http://schemas.microsoft.com/office/drawing/2015/9/8/chartex" xmlns:cx2="http://schemas.microsoft.com/office/drawing/2015/10/21/chartex" xmlns:cx3="http://schemas.microsoft.com/office/drawing/2016/5/9/chartex" xmlns:cx4="http://schemas.microsoft.com/office/drawing/2016/5/10/chartex" xmlns:cx5="http://schemas.microsoft.com/office/drawing/2016/5/11/chartex" xmlns:cx6="http://schemas.microsoft.com/office/drawing/2016/5/12/chartex" xmlns:cx7="http://schemas.microsoft.com/office/drawing/2016/5/13/chartex" xmlns:cx8="http://schemas.microsoft.com/office/drawing/2016/5/14/chartex" xmlns:mc="http://schemas.openxmlformats.org/markup-compatibility/2006" xmlns:aink="http://schemas.microsoft.com/office/drawing/2016/ink" xmlns:am3d="http://schemas.microsoft.com/office/drawing/2017/model3d" xmlns:o="urn:schemas-microsoft-com:office:office" xmlns:oel="http://schemas.microsoft.com/office/2019/extlst" xmlns:r="http://schemas.openxmlformats.org/officeDocument/2006/relationships" xmlns:m="http://schemas.openxmlformats.org/officeDocument/2006/math" xmlns:v="urn:schemas-microsoft-com:vml" xmlns:wp14="http://schemas.microsoft.com/office/word/2010/wordprocessingDrawing" xmlns:wp="http://schemas.openxmlformats.org/drawingml/2006/wordprocessingDrawing" xmlns:w10="urn:schemas-microsoft-com:office:word" xmlns:w="http://schemas.openxmlformats.org/wordprocessingml/2006/main" xmlns:w14="http://schemas.microsoft.com/office/word/2010/wordml" xmlns:w15="http://schemas.microsoft.com/office/word/2012/wordml" xmlns:w16cex="http://schemas.microsoft.com/office/word/2018/wordml/cex" xmlns:w16cid="http://schemas.microsoft.com/office/word/2016/wordml/cid" xmlns:w16="http://schemas.microsoft.com/office/word/2018/wordml" xmlns:w16sdtdh="http://schemas.microsoft.com/office/word/2020/wordml/sdtdatahash" xmlns:w16se="http://schemas.microsoft.com/office/word/2015/wordml/symex" xmlns:wpg="http://schemas.microsoft.com/office/word/2010/wordprocessingGroup" xmlns:wpi="http://schemas.microsoft.com/office/word/2010/wordprocessingInk" xmlns:wne="http://schemas.microsoft.com/office/word/2006/wordml" xmlns:wps="http://schemas.microsoft.com/office/word/2010/wordprocessingShape" mc:Ignorable="w14 w15 w16se w16cid w16 w16cex w16sdtdh wp14">
+<w:endnotes xmlns:wpc="http://schemas.microsoft.com/office/word/2010/wordprocessingCanvas" xmlns:cx="http://schemas.microsoft.com/office/drawing/2014/chartex" xmlns:cx1="http://schemas.microsoft.com/office/drawing/2015/9/8/chartex" xmlns:cx2="http://schemas.microsoft.com/office/drawing/2015/10/21/chartex" xmlns:cx3="http://schemas.microsoft.com/office/drawing/2016/5/9/chartex" xmlns:cx4="http://schemas.microsoft.com/office/drawing/2016/5/10/chartex" xmlns:cx5="http://schemas.microsoft.com/office/drawing/2016/5/11/chartex" xmlns:cx6="http://schemas.microsoft.com/office/drawing/2016/5/12/chartex" xmlns:cx7="http://schemas.microsoft.com/office/drawing/2016/5/13/chartex" xmlns:cx8="http://schemas.microsoft.com/office/drawing/2016/5/14/chartex" xmlns:mc="http://schemas.openxmlformats.org/markup-compatibility/2006" xmlns:aink="http://schemas.microsoft.com/office/drawing/2016/ink" xmlns:am3d="http://schemas.microsoft.com/office/drawing/2017/model3d" xmlns:o="urn:schemas-microsoft-com:office:office" xmlns:oel="http://schemas.microsoft.com/office/2019/extlst" xmlns:r="http://schemas.openxmlformats.org/officeDocument/2006/relationships" xmlns:m="http://schemas.openxmlformats.org/officeDocument/2006/math" xmlns:v="urn:schemas-microsoft-com:vml" xmlns:wp14="http://schemas.microsoft.com/office/word/2010/wordprocessingDrawing" xmlns:wp="http://schemas.openxmlformats.org/drawingml/2006/wordprocessingDrawing" xmlns:w10="urn:schemas-microsoft-com:office:word" xmlns:w="http://schemas.openxmlformats.org/wordprocessingml/2006/main" xmlns:w14="http://schemas.microsoft.com/office/word/2010/wordml" xmlns:w15="http://schemas.microsoft.com/office/word/2012/wordml" xmlns:w16cex="http://schemas.microsoft.com/office/word/2018/wordml/cex" xmlns:w16cid="http://schemas.microsoft.com/office/word/2016/wordml/cid" xmlns:w16="http://schemas.microsoft.com/office/word/2018/wordml" xmlns:w16du="http://schemas.microsoft.com/office/word/2023/wordml/word16du" xmlns:w16sdtdh="http://schemas.microsoft.com/office/word/2020/wordml/sdtdatahash" xmlns:w16sdtfl="http://schemas.microsoft.com/office/word/2024/wordml/sdtformatlock" xmlns:w16se="http://schemas.microsoft.com/office/word/2015/wordml/symex" xmlns:wpg="http://schemas.microsoft.com/office/word/2010/wordprocessingGroup" xmlns:wpi="http://schemas.microsoft.com/office/word/2010/wordprocessingInk" xmlns:wne="http://schemas.microsoft.com/office/word/2006/wordml" xmlns:wps="http://schemas.microsoft.com/office/word/2010/wordprocessingShape" mc:Ignorable="w14 w15 w16se w16cid w16 w16cex w16sdtdh w16sdtfl w16du wp14">
   <w:endnote w:type="separator" w:id="-1">
     <w:p>
       <w:pPr>
@@ -2017,7 +1352,7 @@
 </file>
 
 <file path=word/footer1.xml><?xml version="1.0" encoding="utf-8"?>
-<w:ftr xmlns:wpc="http://schemas.microsoft.com/office/word/2010/wordprocessingCanvas" xmlns:cx="http://schemas.microsoft.com/office/drawing/2014/chartex" xmlns:cx1="http://schemas.microsoft.com/office/drawing/2015/9/8/chartex" xmlns:cx2="http://schemas.microsoft.com/office/drawing/2015/10/21/chartex" xmlns:cx3="http://schemas.microsoft.com/office/drawing/2016/5/9/chartex" xmlns:cx4="http://schemas.microsoft.com/office/drawing/2016/5/10/chartex" xmlns:cx5="http://schemas.microsoft.com/office/drawing/2016/5/11/chartex" xmlns:cx6="http://schemas.microsoft.com/office/drawing/2016/5/12/chartex" xmlns:cx7="http://schemas.microsoft.com/office/drawing/2016/5/13/chartex" xmlns:cx8="http://schemas.microsoft.com/office/drawing/2016/5/14/chartex" xmlns:mc="http://schemas.openxmlformats.org/markup-compatibility/2006" xmlns:aink="http://schemas.microsoft.com/office/drawing/2016/ink" xmlns:am3d="http://schemas.microsoft.com/office/drawing/2017/model3d" xmlns:o="urn:schemas-microsoft-com:office:office" xmlns:oel="http://schemas.microsoft.com/office/2019/extlst" xmlns:r="http://schemas.openxmlformats.org/officeDocument/2006/relationships" xmlns:m="http://schemas.openxmlformats.org/officeDocument/2006/math" xmlns:v="urn:schemas-microsoft-com:vml" xmlns:wp14="http://schemas.microsoft.com/office/word/2010/wordprocessingDrawing" xmlns:wp="http://schemas.openxmlformats.org/drawingml/2006/wordprocessingDrawing" xmlns:w10="urn:schemas-microsoft-com:office:word" xmlns:w="http://schemas.openxmlformats.org/wordprocessingml/2006/main" xmlns:w14="http://schemas.microsoft.com/office/word/2010/wordml" xmlns:w15="http://schemas.microsoft.com/office/word/2012/wordml" xmlns:w16cex="http://schemas.microsoft.com/office/word/2018/wordml/cex" xmlns:w16cid="http://schemas.microsoft.com/office/word/2016/wordml/cid" xmlns:w16="http://schemas.microsoft.com/office/word/2018/wordml" xmlns:w16sdtdh="http://schemas.microsoft.com/office/word/2020/wordml/sdtdatahash" xmlns:w16se="http://schemas.microsoft.com/office/word/2015/wordml/symex" xmlns:wpg="http://schemas.microsoft.com/office/word/2010/wordprocessingGroup" xmlns:wpi="http://schemas.microsoft.com/office/word/2010/wordprocessingInk" xmlns:wne="http://schemas.microsoft.com/office/word/2006/wordml" xmlns:wps="http://schemas.microsoft.com/office/word/2010/wordprocessingShape" mc:Ignorable="w14 w15 w16se w16cid w16 w16cex w16sdtdh wp14">
+<w:ftr xmlns:wpc="http://schemas.microsoft.com/office/word/2010/wordprocessingCanvas" xmlns:cx="http://schemas.microsoft.com/office/drawing/2014/chartex" xmlns:cx1="http://schemas.microsoft.com/office/drawing/2015/9/8/chartex" xmlns:cx2="http://schemas.microsoft.com/office/drawing/2015/10/21/chartex" xmlns:cx3="http://schemas.microsoft.com/office/drawing/2016/5/9/chartex" xmlns:cx4="http://schemas.microsoft.com/office/drawing/2016/5/10/chartex" xmlns:cx5="http://schemas.microsoft.com/office/drawing/2016/5/11/chartex" xmlns:cx6="http://schemas.microsoft.com/office/drawing/2016/5/12/chartex" xmlns:cx7="http://schemas.microsoft.com/office/drawing/2016/5/13/chartex" xmlns:cx8="http://schemas.microsoft.com/office/drawing/2016/5/14/chartex" xmlns:mc="http://schemas.openxmlformats.org/markup-compatibility/2006" xmlns:aink="http://schemas.microsoft.com/office/drawing/2016/ink" xmlns:am3d="http://schemas.microsoft.com/office/drawing/2017/model3d" xmlns:o="urn:schemas-microsoft-com:office:office" xmlns:oel="http://schemas.microsoft.com/office/2019/extlst" xmlns:r="http://schemas.openxmlformats.org/officeDocument/2006/relationships" xmlns:m="http://schemas.openxmlformats.org/officeDocument/2006/math" xmlns:v="urn:schemas-microsoft-com:vml" xmlns:wp14="http://schemas.microsoft.com/office/word/2010/wordprocessingDrawing" xmlns:wp="http://schemas.openxmlformats.org/drawingml/2006/wordprocessingDrawing" xmlns:w10="urn:schemas-microsoft-com:office:word" xmlns:w="http://schemas.openxmlformats.org/wordprocessingml/2006/main" xmlns:w14="http://schemas.microsoft.com/office/word/2010/wordml" xmlns:w15="http://schemas.microsoft.com/office/word/2012/wordml" xmlns:w16cex="http://schemas.microsoft.com/office/word/2018/wordml/cex" xmlns:w16cid="http://schemas.microsoft.com/office/word/2016/wordml/cid" xmlns:w16="http://schemas.microsoft.com/office/word/2018/wordml" xmlns:w16du="http://schemas.microsoft.com/office/word/2023/wordml/word16du" xmlns:w16sdtdh="http://schemas.microsoft.com/office/word/2020/wordml/sdtdatahash" xmlns:w16sdtfl="http://schemas.microsoft.com/office/word/2024/wordml/sdtformatlock" xmlns:w16se="http://schemas.microsoft.com/office/word/2015/wordml/symex" xmlns:wpg="http://schemas.microsoft.com/office/word/2010/wordprocessingGroup" xmlns:wpi="http://schemas.microsoft.com/office/word/2010/wordprocessingInk" xmlns:wne="http://schemas.microsoft.com/office/word/2006/wordml" xmlns:wps="http://schemas.microsoft.com/office/word/2010/wordprocessingShape" mc:Ignorable="w14 w15 w16se w16cid w16 w16cex w16sdtdh w16sdtfl w16du wp14">
   <w:p>
     <w:pPr>
       <w:pBdr>
@@ -2041,7 +1376,7 @@
 </file>
 
 <file path=word/footer2.xml><?xml version="1.0" encoding="utf-8"?>
-<w:ftr xmlns:wpc="http://schemas.microsoft.com/office/word/2010/wordprocessingCanvas" xmlns:cx="http://schemas.microsoft.com/office/drawing/2014/chartex" xmlns:cx1="http://schemas.microsoft.com/office/drawing/2015/9/8/chartex" xmlns:cx2="http://schemas.microsoft.com/office/drawing/2015/10/21/chartex" xmlns:cx3="http://schemas.microsoft.com/office/drawing/2016/5/9/chartex" xmlns:cx4="http://schemas.microsoft.com/office/drawing/2016/5/10/chartex" xmlns:cx5="http://schemas.microsoft.com/office/drawing/2016/5/11/chartex" xmlns:cx6="http://schemas.microsoft.com/office/drawing/2016/5/12/chartex" xmlns:cx7="http://schemas.microsoft.com/office/drawing/2016/5/13/chartex" xmlns:cx8="http://schemas.microsoft.com/office/drawing/2016/5/14/chartex" xmlns:mc="http://schemas.openxmlformats.org/markup-compatibility/2006" xmlns:aink="http://schemas.microsoft.com/office/drawing/2016/ink" xmlns:am3d="http://schemas.microsoft.com/office/drawing/2017/model3d" xmlns:o="urn:schemas-microsoft-com:office:office" xmlns:oel="http://schemas.microsoft.com/office/2019/extlst" xmlns:r="http://schemas.openxmlformats.org/officeDocument/2006/relationships" xmlns:m="http://schemas.openxmlformats.org/officeDocument/2006/math" xmlns:v="urn:schemas-microsoft-com:vml" xmlns:wp14="http://schemas.microsoft.com/office/word/2010/wordprocessingDrawing" xmlns:wp="http://schemas.openxmlformats.org/drawingml/2006/wordprocessingDrawing" xmlns:w10="urn:schemas-microsoft-com:office:word" xmlns:w="http://schemas.openxmlformats.org/wordprocessingml/2006/main" xmlns:w14="http://schemas.microsoft.com/office/word/2010/wordml" xmlns:w15="http://schemas.microsoft.com/office/word/2012/wordml" xmlns:w16cex="http://schemas.microsoft.com/office/word/2018/wordml/cex" xmlns:w16cid="http://schemas.microsoft.com/office/word/2016/wordml/cid" xmlns:w16="http://schemas.microsoft.com/office/word/2018/wordml" xmlns:w16sdtdh="http://schemas.microsoft.com/office/word/2020/wordml/sdtdatahash" xmlns:w16se="http://schemas.microsoft.com/office/word/2015/wordml/symex" xmlns:wpg="http://schemas.microsoft.com/office/word/2010/wordprocessingGroup" xmlns:wpi="http://schemas.microsoft.com/office/word/2010/wordprocessingInk" xmlns:wne="http://schemas.microsoft.com/office/word/2006/wordml" xmlns:wps="http://schemas.microsoft.com/office/word/2010/wordprocessingShape" mc:Ignorable="w14 w15 w16se w16cid w16 w16cex w16sdtdh wp14">
+<w:ftr xmlns:wpc="http://schemas.microsoft.com/office/word/2010/wordprocessingCanvas" xmlns:cx="http://schemas.microsoft.com/office/drawing/2014/chartex" xmlns:cx1="http://schemas.microsoft.com/office/drawing/2015/9/8/chartex" xmlns:cx2="http://schemas.microsoft.com/office/drawing/2015/10/21/chartex" xmlns:cx3="http://schemas.microsoft.com/office/drawing/2016/5/9/chartex" xmlns:cx4="http://schemas.microsoft.com/office/drawing/2016/5/10/chartex" xmlns:cx5="http://schemas.microsoft.com/office/drawing/2016/5/11/chartex" xmlns:cx6="http://schemas.microsoft.com/office/drawing/2016/5/12/chartex" xmlns:cx7="http://schemas.microsoft.com/office/drawing/2016/5/13/chartex" xmlns:cx8="http://schemas.microsoft.com/office/drawing/2016/5/14/chartex" xmlns:mc="http://schemas.openxmlformats.org/markup-compatibility/2006" xmlns:aink="http://schemas.microsoft.com/office/drawing/2016/ink" xmlns:am3d="http://schemas.microsoft.com/office/drawing/2017/model3d" xmlns:o="urn:schemas-microsoft-com:office:office" xmlns:oel="http://schemas.microsoft.com/office/2019/extlst" xmlns:r="http://schemas.openxmlformats.org/officeDocument/2006/relationships" xmlns:m="http://schemas.openxmlformats.org/officeDocument/2006/math" xmlns:v="urn:schemas-microsoft-com:vml" xmlns:wp14="http://schemas.microsoft.com/office/word/2010/wordprocessingDrawing" xmlns:wp="http://schemas.openxmlformats.org/drawingml/2006/wordprocessingDrawing" xmlns:w10="urn:schemas-microsoft-com:office:word" xmlns:w="http://schemas.openxmlformats.org/wordprocessingml/2006/main" xmlns:w14="http://schemas.microsoft.com/office/word/2010/wordml" xmlns:w15="http://schemas.microsoft.com/office/word/2012/wordml" xmlns:w16cex="http://schemas.microsoft.com/office/word/2018/wordml/cex" xmlns:w16cid="http://schemas.microsoft.com/office/word/2016/wordml/cid" xmlns:w16="http://schemas.microsoft.com/office/word/2018/wordml" xmlns:w16du="http://schemas.microsoft.com/office/word/2023/wordml/word16du" xmlns:w16sdtdh="http://schemas.microsoft.com/office/word/2020/wordml/sdtdatahash" xmlns:w16sdtfl="http://schemas.microsoft.com/office/word/2024/wordml/sdtformatlock" xmlns:w16se="http://schemas.microsoft.com/office/word/2015/wordml/symex" xmlns:wpg="http://schemas.microsoft.com/office/word/2010/wordprocessingGroup" xmlns:wpi="http://schemas.microsoft.com/office/word/2010/wordprocessingInk" xmlns:wne="http://schemas.microsoft.com/office/word/2006/wordml" xmlns:wps="http://schemas.microsoft.com/office/word/2010/wordprocessingShape" mc:Ignorable="w14 w15 w16se w16cid w16 w16cex w16sdtdh w16sdtfl w16du wp14">
   <w:p>
     <w:pPr>
       <w:pBdr>
@@ -2065,7 +1400,7 @@
 </file>
 
 <file path=word/footer3.xml><?xml version="1.0" encoding="utf-8"?>
-<w:ftr xmlns:wpc="http://schemas.microsoft.com/office/word/2010/wordprocessingCanvas" xmlns:cx="http://schemas.microsoft.com/office/drawing/2014/chartex" xmlns:cx1="http://schemas.microsoft.com/office/drawing/2015/9/8/chartex" xmlns:cx2="http://schemas.microsoft.com/office/drawing/2015/10/21/chartex" xmlns:cx3="http://schemas.microsoft.com/office/drawing/2016/5/9/chartex" xmlns:cx4="http://schemas.microsoft.com/office/drawing/2016/5/10/chartex" xmlns:cx5="http://schemas.microsoft.com/office/drawing/2016/5/11/chartex" xmlns:cx6="http://schemas.microsoft.com/office/drawing/2016/5/12/chartex" xmlns:cx7="http://schemas.microsoft.com/office/drawing/2016/5/13/chartex" xmlns:cx8="http://schemas.microsoft.com/office/drawing/2016/5/14/chartex" xmlns:mc="http://schemas.openxmlformats.org/markup-compatibility/2006" xmlns:aink="http://schemas.microsoft.com/office/drawing/2016/ink" xmlns:am3d="http://schemas.microsoft.com/office/drawing/2017/model3d" xmlns:o="urn:schemas-microsoft-com:office:office" xmlns:oel="http://schemas.microsoft.com/office/2019/extlst" xmlns:r="http://schemas.openxmlformats.org/officeDocument/2006/relationships" xmlns:m="http://schemas.openxmlformats.org/officeDocument/2006/math" xmlns:v="urn:schemas-microsoft-com:vml" xmlns:wp14="http://schemas.microsoft.com/office/word/2010/wordprocessingDrawing" xmlns:wp="http://schemas.openxmlformats.org/drawingml/2006/wordprocessingDrawing" xmlns:w10="urn:schemas-microsoft-com:office:word" xmlns:w="http://schemas.openxmlformats.org/wordprocessingml/2006/main" xmlns:w14="http://schemas.microsoft.com/office/word/2010/wordml" xmlns:w15="http://schemas.microsoft.com/office/word/2012/wordml" xmlns:w16cex="http://schemas.microsoft.com/office/word/2018/wordml/cex" xmlns:w16cid="http://schemas.microsoft.com/office/word/2016/wordml/cid" xmlns:w16="http://schemas.microsoft.com/office/word/2018/wordml" xmlns:w16sdtdh="http://schemas.microsoft.com/office/word/2020/wordml/sdtdatahash" xmlns:w16se="http://schemas.microsoft.com/office/word/2015/wordml/symex" xmlns:wpg="http://schemas.microsoft.com/office/word/2010/wordprocessingGroup" xmlns:wpi="http://schemas.microsoft.com/office/word/2010/wordprocessingInk" xmlns:wne="http://schemas.microsoft.com/office/word/2006/wordml" xmlns:wps="http://schemas.microsoft.com/office/word/2010/wordprocessingShape" mc:Ignorable="w14 w15 w16se w16cid w16 w16cex w16sdtdh wp14">
+<w:ftr xmlns:wpc="http://schemas.microsoft.com/office/word/2010/wordprocessingCanvas" xmlns:cx="http://schemas.microsoft.com/office/drawing/2014/chartex" xmlns:cx1="http://schemas.microsoft.com/office/drawing/2015/9/8/chartex" xmlns:cx2="http://schemas.microsoft.com/office/drawing/2015/10/21/chartex" xmlns:cx3="http://schemas.microsoft.com/office/drawing/2016/5/9/chartex" xmlns:cx4="http://schemas.microsoft.com/office/drawing/2016/5/10/chartex" xmlns:cx5="http://schemas.microsoft.com/office/drawing/2016/5/11/chartex" xmlns:cx6="http://schemas.microsoft.com/office/drawing/2016/5/12/chartex" xmlns:cx7="http://schemas.microsoft.com/office/drawing/2016/5/13/chartex" xmlns:cx8="http://schemas.microsoft.com/office/drawing/2016/5/14/chartex" xmlns:mc="http://schemas.openxmlformats.org/markup-compatibility/2006" xmlns:aink="http://schemas.microsoft.com/office/drawing/2016/ink" xmlns:am3d="http://schemas.microsoft.com/office/drawing/2017/model3d" xmlns:o="urn:schemas-microsoft-com:office:office" xmlns:oel="http://schemas.microsoft.com/office/2019/extlst" xmlns:r="http://schemas.openxmlformats.org/officeDocument/2006/relationships" xmlns:m="http://schemas.openxmlformats.org/officeDocument/2006/math" xmlns:v="urn:schemas-microsoft-com:vml" xmlns:wp14="http://schemas.microsoft.com/office/word/2010/wordprocessingDrawing" xmlns:wp="http://schemas.openxmlformats.org/drawingml/2006/wordprocessingDrawing" xmlns:w10="urn:schemas-microsoft-com:office:word" xmlns:w="http://schemas.openxmlformats.org/wordprocessingml/2006/main" xmlns:w14="http://schemas.microsoft.com/office/word/2010/wordml" xmlns:w15="http://schemas.microsoft.com/office/word/2012/wordml" xmlns:w16cex="http://schemas.microsoft.com/office/word/2018/wordml/cex" xmlns:w16cid="http://schemas.microsoft.com/office/word/2016/wordml/cid" xmlns:w16="http://schemas.microsoft.com/office/word/2018/wordml" xmlns:w16du="http://schemas.microsoft.com/office/word/2023/wordml/word16du" xmlns:w16sdtdh="http://schemas.microsoft.com/office/word/2020/wordml/sdtdatahash" xmlns:w16sdtfl="http://schemas.microsoft.com/office/word/2024/wordml/sdtformatlock" xmlns:w16se="http://schemas.microsoft.com/office/word/2015/wordml/symex" xmlns:wpg="http://schemas.microsoft.com/office/word/2010/wordprocessingGroup" xmlns:wpi="http://schemas.microsoft.com/office/word/2010/wordprocessingInk" xmlns:wne="http://schemas.microsoft.com/office/word/2006/wordml" xmlns:wps="http://schemas.microsoft.com/office/word/2010/wordprocessingShape" mc:Ignorable="w14 w15 w16se w16cid w16 w16cex w16sdtdh w16sdtfl w16du wp14">
   <w:p>
     <w:pPr>
       <w:pBdr>
@@ -2089,7 +1424,7 @@
 </file>
 
 <file path=word/footnotes.xml><?xml version="1.0" encoding="utf-8"?>
-<w:footnotes xmlns:wpc="http://schemas.microsoft.com/office/word/2010/wordprocessingCanvas" xmlns:cx="http://schemas.microsoft.com/office/drawing/2014/chartex" xmlns:cx1="http://schemas.microsoft.com/office/drawing/2015/9/8/chartex" xmlns:cx2="http://schemas.microsoft.com/office/drawing/2015/10/21/chartex" xmlns:cx3="http://schemas.microsoft.com/office/drawing/2016/5/9/chartex" xmlns:cx4="http://schemas.microsoft.com/office/drawing/2016/5/10/chartex" xmlns:cx5="http://schemas.microsoft.com/office/drawing/2016/5/11/chartex" xmlns:cx6="http://schemas.microsoft.com/office/drawing/2016/5/12/chartex" xmlns:cx7="http://schemas.microsoft.com/office/drawing/2016/5/13/chartex" xmlns:cx8="http://schemas.microsoft.com/office/drawing/2016/5/14/chartex" xmlns:mc="http://schemas.openxmlformats.org/markup-compatibility/2006" xmlns:aink="http://schemas.microsoft.com/office/drawing/2016/ink" xmlns:am3d="http://schemas.microsoft.com/office/drawing/2017/model3d" xmlns:o="urn:schemas-microsoft-com:office:office" xmlns:oel="http://schemas.microsoft.com/office/2019/extlst" xmlns:r="http://schemas.openxmlformats.org/officeDocument/2006/relationships" xmlns:m="http://schemas.openxmlformats.org/officeDocument/2006/math" xmlns:v="urn:schemas-microsoft-com:vml" xmlns:wp14="http://schemas.microsoft.com/office/word/2010/wordprocessingDrawing" xmlns:wp="http://schemas.openxmlformats.org/drawingml/2006/wordprocessingDrawing" xmlns:w10="urn:schemas-microsoft-com:office:word" xmlns:w="http://schemas.openxmlformats.org/wordprocessingml/2006/main" xmlns:w14="http://schemas.microsoft.com/office/word/2010/wordml" xmlns:w15="http://schemas.microsoft.com/office/word/2012/wordml" xmlns:w16cex="http://schemas.microsoft.com/office/word/2018/wordml/cex" xmlns:w16cid="http://schemas.microsoft.com/office/word/2016/wordml/cid" xmlns:w16="http://schemas.microsoft.com/office/word/2018/wordml" xmlns:w16sdtdh="http://schemas.microsoft.com/office/word/2020/wordml/sdtdatahash" xmlns:w16se="http://schemas.microsoft.com/office/word/2015/wordml/symex" xmlns:wpg="http://schemas.microsoft.com/office/word/2010/wordprocessingGroup" xmlns:wpi="http://schemas.microsoft.com/office/word/2010/wordprocessingInk" xmlns:wne="http://schemas.microsoft.com/office/word/2006/wordml" xmlns:wps="http://schemas.microsoft.com/office/word/2010/wordprocessingShape" mc:Ignorable="w14 w15 w16se w16cid w16 w16cex w16sdtdh wp14">
+<w:footnotes xmlns:wpc="http://schemas.microsoft.com/office/word/2010/wordprocessingCanvas" xmlns:cx="http://schemas.microsoft.com/office/drawing/2014/chartex" xmlns:cx1="http://schemas.microsoft.com/office/drawing/2015/9/8/chartex" xmlns:cx2="http://schemas.microsoft.com/office/drawing/2015/10/21/chartex" xmlns:cx3="http://schemas.microsoft.com/office/drawing/2016/5/9/chartex" xmlns:cx4="http://schemas.microsoft.com/office/drawing/2016/5/10/chartex" xmlns:cx5="http://schemas.microsoft.com/office/drawing/2016/5/11/chartex" xmlns:cx6="http://schemas.microsoft.com/office/drawing/2016/5/12/chartex" xmlns:cx7="http://schemas.microsoft.com/office/drawing/2016/5/13/chartex" xmlns:cx8="http://schemas.microsoft.com/office/drawing/2016/5/14/chartex" xmlns:mc="http://schemas.openxmlformats.org/markup-compatibility/2006" xmlns:aink="http://schemas.microsoft.com/office/drawing/2016/ink" xmlns:am3d="http://schemas.microsoft.com/office/drawing/2017/model3d" xmlns:o="urn:schemas-microsoft-com:office:office" xmlns:oel="http://schemas.microsoft.com/office/2019/extlst" xmlns:r="http://schemas.openxmlformats.org/officeDocument/2006/relationships" xmlns:m="http://schemas.openxmlformats.org/officeDocument/2006/math" xmlns:v="urn:schemas-microsoft-com:vml" xmlns:wp14="http://schemas.microsoft.com/office/word/2010/wordprocessingDrawing" xmlns:wp="http://schemas.openxmlformats.org/drawingml/2006/wordprocessingDrawing" xmlns:w10="urn:schemas-microsoft-com:office:word" xmlns:w="http://schemas.openxmlformats.org/wordprocessingml/2006/main" xmlns:w14="http://schemas.microsoft.com/office/word/2010/wordml" xmlns:w15="http://schemas.microsoft.com/office/word/2012/wordml" xmlns:w16cex="http://schemas.microsoft.com/office/word/2018/wordml/cex" xmlns:w16cid="http://schemas.microsoft.com/office/word/2016/wordml/cid" xmlns:w16="http://schemas.microsoft.com/office/word/2018/wordml" xmlns:w16du="http://schemas.microsoft.com/office/word/2023/wordml/word16du" xmlns:w16sdtdh="http://schemas.microsoft.com/office/word/2020/wordml/sdtdatahash" xmlns:w16sdtfl="http://schemas.microsoft.com/office/word/2024/wordml/sdtformatlock" xmlns:w16se="http://schemas.microsoft.com/office/word/2015/wordml/symex" xmlns:wpg="http://schemas.microsoft.com/office/word/2010/wordprocessingGroup" xmlns:wpi="http://schemas.microsoft.com/office/word/2010/wordprocessingInk" xmlns:wne="http://schemas.microsoft.com/office/word/2006/wordml" xmlns:wps="http://schemas.microsoft.com/office/word/2010/wordprocessingShape" mc:Ignorable="w14 w15 w16se w16cid w16 w16cex w16sdtdh w16sdtfl w16du wp14">
   <w:footnote w:type="separator" w:id="-1">
     <w:p>
       <w:pPr>
@@ -2114,7 +1449,7 @@
 </file>
 
 <file path=word/header1.xml><?xml version="1.0" encoding="utf-8"?>
-<w:hdr xmlns:wpc="http://schemas.microsoft.com/office/word/2010/wordprocessingCanvas" xmlns:cx="http://schemas.microsoft.com/office/drawing/2014/chartex" xmlns:cx1="http://schemas.microsoft.com/office/drawing/2015/9/8/chartex" xmlns:cx2="http://schemas.microsoft.com/office/drawing/2015/10/21/chartex" xmlns:cx3="http://schemas.microsoft.com/office/drawing/2016/5/9/chartex" xmlns:cx4="http://schemas.microsoft.com/office/drawing/2016/5/10/chartex" xmlns:cx5="http://schemas.microsoft.com/office/drawing/2016/5/11/chartex" xmlns:cx6="http://schemas.microsoft.com/office/drawing/2016/5/12/chartex" xmlns:cx7="http://schemas.microsoft.com/office/drawing/2016/5/13/chartex" xmlns:cx8="http://schemas.microsoft.com/office/drawing/2016/5/14/chartex" xmlns:mc="http://schemas.openxmlformats.org/markup-compatibility/2006" xmlns:aink="http://schemas.microsoft.com/office/drawing/2016/ink" xmlns:am3d="http://schemas.microsoft.com/office/drawing/2017/model3d" xmlns:o="urn:schemas-microsoft-com:office:office" xmlns:oel="http://schemas.microsoft.com/office/2019/extlst" xmlns:r="http://schemas.openxmlformats.org/officeDocument/2006/relationships" xmlns:m="http://schemas.openxmlformats.org/officeDocument/2006/math" xmlns:v="urn:schemas-microsoft-com:vml" xmlns:wp14="http://schemas.microsoft.com/office/word/2010/wordprocessingDrawing" xmlns:wp="http://schemas.openxmlformats.org/drawingml/2006/wordprocessingDrawing" xmlns:w10="urn:schemas-microsoft-com:office:word" xmlns:w="http://schemas.openxmlformats.org/wordprocessingml/2006/main" xmlns:w14="http://schemas.microsoft.com/office/word/2010/wordml" xmlns:w15="http://schemas.microsoft.com/office/word/2012/wordml" xmlns:w16cex="http://schemas.microsoft.com/office/word/2018/wordml/cex" xmlns:w16cid="http://schemas.microsoft.com/office/word/2016/wordml/cid" xmlns:w16="http://schemas.microsoft.com/office/word/2018/wordml" xmlns:w16sdtdh="http://schemas.microsoft.com/office/word/2020/wordml/sdtdatahash" xmlns:w16se="http://schemas.microsoft.com/office/word/2015/wordml/symex" xmlns:wpg="http://schemas.microsoft.com/office/word/2010/wordprocessingGroup" xmlns:wpi="http://schemas.microsoft.com/office/word/2010/wordprocessingInk" xmlns:wne="http://schemas.microsoft.com/office/word/2006/wordml" xmlns:wps="http://schemas.microsoft.com/office/word/2010/wordprocessingShape" mc:Ignorable="w14 w15 w16se w16cid w16 w16cex w16sdtdh wp14">
+<w:hdr xmlns:wpc="http://schemas.microsoft.com/office/word/2010/wordprocessingCanvas" xmlns:cx="http://schemas.microsoft.com/office/drawing/2014/chartex" xmlns:cx1="http://schemas.microsoft.com/office/drawing/2015/9/8/chartex" xmlns:cx2="http://schemas.microsoft.com/office/drawing/2015/10/21/chartex" xmlns:cx3="http://schemas.microsoft.com/office/drawing/2016/5/9/chartex" xmlns:cx4="http://schemas.microsoft.com/office/drawing/2016/5/10/chartex" xmlns:cx5="http://schemas.microsoft.com/office/drawing/2016/5/11/chartex" xmlns:cx6="http://schemas.microsoft.com/office/drawing/2016/5/12/chartex" xmlns:cx7="http://schemas.microsoft.com/office/drawing/2016/5/13/chartex" xmlns:cx8="http://schemas.microsoft.com/office/drawing/2016/5/14/chartex" xmlns:mc="http://schemas.openxmlformats.org/markup-compatibility/2006" xmlns:aink="http://schemas.microsoft.com/office/drawing/2016/ink" xmlns:am3d="http://schemas.microsoft.com/office/drawing/2017/model3d" xmlns:o="urn:schemas-microsoft-com:office:office" xmlns:oel="http://schemas.microsoft.com/office/2019/extlst" xmlns:r="http://schemas.openxmlformats.org/officeDocument/2006/relationships" xmlns:m="http://schemas.openxmlformats.org/officeDocument/2006/math" xmlns:v="urn:schemas-microsoft-com:vml" xmlns:wp14="http://schemas.microsoft.com/office/word/2010/wordprocessingDrawing" xmlns:wp="http://schemas.openxmlformats.org/drawingml/2006/wordprocessingDrawing" xmlns:w10="urn:schemas-microsoft-com:office:word" xmlns:w="http://schemas.openxmlformats.org/wordprocessingml/2006/main" xmlns:w14="http://schemas.microsoft.com/office/word/2010/wordml" xmlns:w15="http://schemas.microsoft.com/office/word/2012/wordml" xmlns:w16cex="http://schemas.microsoft.com/office/word/2018/wordml/cex" xmlns:w16cid="http://schemas.microsoft.com/office/word/2016/wordml/cid" xmlns:w16="http://schemas.microsoft.com/office/word/2018/wordml" xmlns:w16du="http://schemas.microsoft.com/office/word/2023/wordml/word16du" xmlns:w16sdtdh="http://schemas.microsoft.com/office/word/2020/wordml/sdtdatahash" xmlns:w16sdtfl="http://schemas.microsoft.com/office/word/2024/wordml/sdtformatlock" xmlns:w16se="http://schemas.microsoft.com/office/word/2015/wordml/symex" xmlns:wpg="http://schemas.microsoft.com/office/word/2010/wordprocessingGroup" xmlns:wpi="http://schemas.microsoft.com/office/word/2010/wordprocessingInk" xmlns:wne="http://schemas.microsoft.com/office/word/2006/wordml" xmlns:wps="http://schemas.microsoft.com/office/word/2010/wordprocessingShape" mc:Ignorable="w14 w15 w16se w16cid w16 w16cex w16sdtdh w16sdtfl w16du wp14">
   <w:p>
     <w:pPr>
       <w:pBdr>
@@ -2138,7 +1473,7 @@
 </file>
 
 <file path=word/header2.xml><?xml version="1.0" encoding="utf-8"?>
-<w:hdr xmlns:wpc="http://schemas.microsoft.com/office/word/2010/wordprocessingCanvas" xmlns:cx="http://schemas.microsoft.com/office/drawing/2014/chartex" xmlns:cx1="http://schemas.microsoft.com/office/drawing/2015/9/8/chartex" xmlns:cx2="http://schemas.microsoft.com/office/drawing/2015/10/21/chartex" xmlns:cx3="http://schemas.microsoft.com/office/drawing/2016/5/9/chartex" xmlns:cx4="http://schemas.microsoft.com/office/drawing/2016/5/10/chartex" xmlns:cx5="http://schemas.microsoft.com/office/drawing/2016/5/11/chartex" xmlns:cx6="http://schemas.microsoft.com/office/drawing/2016/5/12/chartex" xmlns:cx7="http://schemas.microsoft.com/office/drawing/2016/5/13/chartex" xmlns:cx8="http://schemas.microsoft.com/office/drawing/2016/5/14/chartex" xmlns:mc="http://schemas.openxmlformats.org/markup-compatibility/2006" xmlns:aink="http://schemas.microsoft.com/office/drawing/2016/ink" xmlns:am3d="http://schemas.microsoft.com/office/drawing/2017/model3d" xmlns:o="urn:schemas-microsoft-com:office:office" xmlns:oel="http://schemas.microsoft.com/office/2019/extlst" xmlns:r="http://schemas.openxmlformats.org/officeDocument/2006/relationships" xmlns:m="http://schemas.openxmlformats.org/officeDocument/2006/math" xmlns:v="urn:schemas-microsoft-com:vml" xmlns:wp14="http://schemas.microsoft.com/office/word/2010/wordprocessingDrawing" xmlns:wp="http://schemas.openxmlformats.org/drawingml/2006/wordprocessingDrawing" xmlns:w10="urn:schemas-microsoft-com:office:word" xmlns:w="http://schemas.openxmlformats.org/wordprocessingml/2006/main" xmlns:w14="http://schemas.microsoft.com/office/word/2010/wordml" xmlns:w15="http://schemas.microsoft.com/office/word/2012/wordml" xmlns:w16cex="http://schemas.microsoft.com/office/word/2018/wordml/cex" xmlns:w16cid="http://schemas.microsoft.com/office/word/2016/wordml/cid" xmlns:w16="http://schemas.microsoft.com/office/word/2018/wordml" xmlns:w16sdtdh="http://schemas.microsoft.com/office/word/2020/wordml/sdtdatahash" xmlns:w16se="http://schemas.microsoft.com/office/word/2015/wordml/symex" xmlns:wpg="http://schemas.microsoft.com/office/word/2010/wordprocessingGroup" xmlns:wpi="http://schemas.microsoft.com/office/word/2010/wordprocessingInk" xmlns:wne="http://schemas.microsoft.com/office/word/2006/wordml" xmlns:wps="http://schemas.microsoft.com/office/word/2010/wordprocessingShape" mc:Ignorable="w14 w15 w16se w16cid w16 w16cex w16sdtdh wp14">
+<w:hdr xmlns:wpc="http://schemas.microsoft.com/office/word/2010/wordprocessingCanvas" xmlns:cx="http://schemas.microsoft.com/office/drawing/2014/chartex" xmlns:cx1="http://schemas.microsoft.com/office/drawing/2015/9/8/chartex" xmlns:cx2="http://schemas.microsoft.com/office/drawing/2015/10/21/chartex" xmlns:cx3="http://schemas.microsoft.com/office/drawing/2016/5/9/chartex" xmlns:cx4="http://schemas.microsoft.com/office/drawing/2016/5/10/chartex" xmlns:cx5="http://schemas.microsoft.com/office/drawing/2016/5/11/chartex" xmlns:cx6="http://schemas.microsoft.com/office/drawing/2016/5/12/chartex" xmlns:cx7="http://schemas.microsoft.com/office/drawing/2016/5/13/chartex" xmlns:cx8="http://schemas.microsoft.com/office/drawing/2016/5/14/chartex" xmlns:mc="http://schemas.openxmlformats.org/markup-compatibility/2006" xmlns:aink="http://schemas.microsoft.com/office/drawing/2016/ink" xmlns:am3d="http://schemas.microsoft.com/office/drawing/2017/model3d" xmlns:o="urn:schemas-microsoft-com:office:office" xmlns:oel="http://schemas.microsoft.com/office/2019/extlst" xmlns:r="http://schemas.openxmlformats.org/officeDocument/2006/relationships" xmlns:m="http://schemas.openxmlformats.org/officeDocument/2006/math" xmlns:v="urn:schemas-microsoft-com:vml" xmlns:wp14="http://schemas.microsoft.com/office/word/2010/wordprocessingDrawing" xmlns:wp="http://schemas.openxmlformats.org/drawingml/2006/wordprocessingDrawing" xmlns:w10="urn:schemas-microsoft-com:office:word" xmlns:w="http://schemas.openxmlformats.org/wordprocessingml/2006/main" xmlns:w14="http://schemas.microsoft.com/office/word/2010/wordml" xmlns:w15="http://schemas.microsoft.com/office/word/2012/wordml" xmlns:w16cex="http://schemas.microsoft.com/office/word/2018/wordml/cex" xmlns:w16cid="http://schemas.microsoft.com/office/word/2016/wordml/cid" xmlns:w16="http://schemas.microsoft.com/office/word/2018/wordml" xmlns:w16du="http://schemas.microsoft.com/office/word/2023/wordml/word16du" xmlns:w16sdtdh="http://schemas.microsoft.com/office/word/2020/wordml/sdtdatahash" xmlns:w16sdtfl="http://schemas.microsoft.com/office/word/2024/wordml/sdtformatlock" xmlns:w16se="http://schemas.microsoft.com/office/word/2015/wordml/symex" xmlns:wpg="http://schemas.microsoft.com/office/word/2010/wordprocessingGroup" xmlns:wpi="http://schemas.microsoft.com/office/word/2010/wordprocessingInk" xmlns:wne="http://schemas.microsoft.com/office/word/2006/wordml" xmlns:wps="http://schemas.microsoft.com/office/word/2010/wordprocessingShape" mc:Ignorable="w14 w15 w16se w16cid w16 w16cex w16sdtdh w16sdtfl w16du wp14">
   <w:p>
     <w:pPr>
       <w:pBdr>
@@ -2162,7 +1497,7 @@
 </file>
 
 <file path=word/header3.xml><?xml version="1.0" encoding="utf-8"?>
-<w:hdr xmlns:wpc="http://schemas.microsoft.com/office/word/2010/wordprocessingCanvas" xmlns:cx="http://schemas.microsoft.com/office/drawing/2014/chartex" xmlns:cx1="http://schemas.microsoft.com/office/drawing/2015/9/8/chartex" xmlns:cx2="http://schemas.microsoft.com/office/drawing/2015/10/21/chartex" xmlns:cx3="http://schemas.microsoft.com/office/drawing/2016/5/9/chartex" xmlns:cx4="http://schemas.microsoft.com/office/drawing/2016/5/10/chartex" xmlns:cx5="http://schemas.microsoft.com/office/drawing/2016/5/11/chartex" xmlns:cx6="http://schemas.microsoft.com/office/drawing/2016/5/12/chartex" xmlns:cx7="http://schemas.microsoft.com/office/drawing/2016/5/13/chartex" xmlns:cx8="http://schemas.microsoft.com/office/drawing/2016/5/14/chartex" xmlns:mc="http://schemas.openxmlformats.org/markup-compatibility/2006" xmlns:aink="http://schemas.microsoft.com/office/drawing/2016/ink" xmlns:am3d="http://schemas.microsoft.com/office/drawing/2017/model3d" xmlns:o="urn:schemas-microsoft-com:office:office" xmlns:oel="http://schemas.microsoft.com/office/2019/extlst" xmlns:r="http://schemas.openxmlformats.org/officeDocument/2006/relationships" xmlns:m="http://schemas.openxmlformats.org/officeDocument/2006/math" xmlns:v="urn:schemas-microsoft-com:vml" xmlns:wp14="http://schemas.microsoft.com/office/word/2010/wordprocessingDrawing" xmlns:wp="http://schemas.openxmlformats.org/drawingml/2006/wordprocessingDrawing" xmlns:w10="urn:schemas-microsoft-com:office:word" xmlns:w="http://schemas.openxmlformats.org/wordprocessingml/2006/main" xmlns:w14="http://schemas.microsoft.com/office/word/2010/wordml" xmlns:w15="http://schemas.microsoft.com/office/word/2012/wordml" xmlns:w16cex="http://schemas.microsoft.com/office/word/2018/wordml/cex" xmlns:w16cid="http://schemas.microsoft.com/office/word/2016/wordml/cid" xmlns:w16="http://schemas.microsoft.com/office/word/2018/wordml" xmlns:w16sdtdh="http://schemas.microsoft.com/office/word/2020/wordml/sdtdatahash" xmlns:w16se="http://schemas.microsoft.com/office/word/2015/wordml/symex" xmlns:wpg="http://schemas.microsoft.com/office/word/2010/wordprocessingGroup" xmlns:wpi="http://schemas.microsoft.com/office/word/2010/wordprocessingInk" xmlns:wne="http://schemas.microsoft.com/office/word/2006/wordml" xmlns:wps="http://schemas.microsoft.com/office/word/2010/wordprocessingShape" mc:Ignorable="w14 w15 w16se w16cid w16 w16cex w16sdtdh wp14">
+<w:hdr xmlns:wpc="http://schemas.microsoft.com/office/word/2010/wordprocessingCanvas" xmlns:cx="http://schemas.microsoft.com/office/drawing/2014/chartex" xmlns:cx1="http://schemas.microsoft.com/office/drawing/2015/9/8/chartex" xmlns:cx2="http://schemas.microsoft.com/office/drawing/2015/10/21/chartex" xmlns:cx3="http://schemas.microsoft.com/office/drawing/2016/5/9/chartex" xmlns:cx4="http://schemas.microsoft.com/office/drawing/2016/5/10/chartex" xmlns:cx5="http://schemas.microsoft.com/office/drawing/2016/5/11/chartex" xmlns:cx6="http://schemas.microsoft.com/office/drawing/2016/5/12/chartex" xmlns:cx7="http://schemas.microsoft.com/office/drawing/2016/5/13/chartex" xmlns:cx8="http://schemas.microsoft.com/office/drawing/2016/5/14/chartex" xmlns:mc="http://schemas.openxmlformats.org/markup-compatibility/2006" xmlns:aink="http://schemas.microsoft.com/office/drawing/2016/ink" xmlns:am3d="http://schemas.microsoft.com/office/drawing/2017/model3d" xmlns:o="urn:schemas-microsoft-com:office:office" xmlns:oel="http://schemas.microsoft.com/office/2019/extlst" xmlns:r="http://schemas.openxmlformats.org/officeDocument/2006/relationships" xmlns:m="http://schemas.openxmlformats.org/officeDocument/2006/math" xmlns:v="urn:schemas-microsoft-com:vml" xmlns:wp14="http://schemas.microsoft.com/office/word/2010/wordprocessingDrawing" xmlns:wp="http://schemas.openxmlformats.org/drawingml/2006/wordprocessingDrawing" xmlns:w10="urn:schemas-microsoft-com:office:word" xmlns:w="http://schemas.openxmlformats.org/wordprocessingml/2006/main" xmlns:w14="http://schemas.microsoft.com/office/word/2010/wordml" xmlns:w15="http://schemas.microsoft.com/office/word/2012/wordml" xmlns:w16cex="http://schemas.microsoft.com/office/word/2018/wordml/cex" xmlns:w16cid="http://schemas.microsoft.com/office/word/2016/wordml/cid" xmlns:w16="http://schemas.microsoft.com/office/word/2018/wordml" xmlns:w16du="http://schemas.microsoft.com/office/word/2023/wordml/word16du" xmlns:w16sdtdh="http://schemas.microsoft.com/office/word/2020/wordml/sdtdatahash" xmlns:w16sdtfl="http://schemas.microsoft.com/office/word/2024/wordml/sdtformatlock" xmlns:w16se="http://schemas.microsoft.com/office/word/2015/wordml/symex" xmlns:wpg="http://schemas.microsoft.com/office/word/2010/wordprocessingGroup" xmlns:wpi="http://schemas.microsoft.com/office/word/2010/wordprocessingInk" xmlns:wne="http://schemas.microsoft.com/office/word/2006/wordml" xmlns:wps="http://schemas.microsoft.com/office/word/2010/wordprocessingShape" mc:Ignorable="w14 w15 w16se w16cid w16 w16cex w16sdtdh w16sdtfl w16du wp14">
   <w:p>
     <w:pPr>
       <w:pBdr>
@@ -2186,7 +1521,7 @@
 </file>
 
 <file path=word/numbering.xml><?xml version="1.0" encoding="utf-8"?>
-<w:numbering xmlns:wpc="http://schemas.microsoft.com/office/word/2010/wordprocessingCanvas" xmlns:cx="http://schemas.microsoft.com/office/drawing/2014/chartex" xmlns:cx1="http://schemas.microsoft.com/office/drawing/2015/9/8/chartex" xmlns:cx2="http://schemas.microsoft.com/office/drawing/2015/10/21/chartex" xmlns:cx3="http://schemas.microsoft.com/office/drawing/2016/5/9/chartex" xmlns:cx4="http://schemas.microsoft.com/office/drawing/2016/5/10/chartex" xmlns:cx5="http://schemas.microsoft.com/office/drawing/2016/5/11/chartex" xmlns:cx6="http://schemas.microsoft.com/office/drawing/2016/5/12/chartex" xmlns:cx7="http://schemas.microsoft.com/office/drawing/2016/5/13/chartex" xmlns:cx8="http://schemas.microsoft.com/office/drawing/2016/5/14/chartex" xmlns:mc="http://schemas.openxmlformats.org/markup-compatibility/2006" xmlns:aink="http://schemas.microsoft.com/office/drawing/2016/ink" xmlns:am3d="http://schemas.microsoft.com/office/drawing/2017/model3d" xmlns:o="urn:schemas-microsoft-com:office:office" xmlns:oel="http://schemas.microsoft.com/office/2019/extlst" xmlns:r="http://schemas.openxmlformats.org/officeDocument/2006/relationships" xmlns:m="http://schemas.openxmlformats.org/officeDocument/2006/math" xmlns:v="urn:schemas-microsoft-com:vml" xmlns:wp14="http://schemas.microsoft.com/office/word/2010/wordprocessingDrawing" xmlns:wp="http://schemas.openxmlformats.org/drawingml/2006/wordprocessingDrawing" xmlns:w10="urn:schemas-microsoft-com:office:word" xmlns:w="http://schemas.openxmlformats.org/wordprocessingml/2006/main" xmlns:w14="http://schemas.microsoft.com/office/word/2010/wordml" xmlns:w15="http://schemas.microsoft.com/office/word/2012/wordml" xmlns:w16cex="http://schemas.microsoft.com/office/word/2018/wordml/cex" xmlns:w16cid="http://schemas.microsoft.com/office/word/2016/wordml/cid" xmlns:w16="http://schemas.microsoft.com/office/word/2018/wordml" xmlns:w16sdtdh="http://schemas.microsoft.com/office/word/2020/wordml/sdtdatahash" xmlns:w16se="http://schemas.microsoft.com/office/word/2015/wordml/symex" xmlns:wpg="http://schemas.microsoft.com/office/word/2010/wordprocessingGroup" xmlns:wpi="http://schemas.microsoft.com/office/word/2010/wordprocessingInk" xmlns:wne="http://schemas.microsoft.com/office/word/2006/wordml" xmlns:wps="http://schemas.microsoft.com/office/word/2010/wordprocessingShape" mc:Ignorable="w14 w15 w16se w16cid w16 w16cex w16sdtdh wp14">
+<w:numbering xmlns:wpc="http://schemas.microsoft.com/office/word/2010/wordprocessingCanvas" xmlns:cx="http://schemas.microsoft.com/office/drawing/2014/chartex" xmlns:cx1="http://schemas.microsoft.com/office/drawing/2015/9/8/chartex" xmlns:cx2="http://schemas.microsoft.com/office/drawing/2015/10/21/chartex" xmlns:cx3="http://schemas.microsoft.com/office/drawing/2016/5/9/chartex" xmlns:cx4="http://schemas.microsoft.com/office/drawing/2016/5/10/chartex" xmlns:cx5="http://schemas.microsoft.com/office/drawing/2016/5/11/chartex" xmlns:cx6="http://schemas.microsoft.com/office/drawing/2016/5/12/chartex" xmlns:cx7="http://schemas.microsoft.com/office/drawing/2016/5/13/chartex" xmlns:cx8="http://schemas.microsoft.com/office/drawing/2016/5/14/chartex" xmlns:mc="http://schemas.openxmlformats.org/markup-compatibility/2006" xmlns:aink="http://schemas.microsoft.com/office/drawing/2016/ink" xmlns:am3d="http://schemas.microsoft.com/office/drawing/2017/model3d" xmlns:o="urn:schemas-microsoft-com:office:office" xmlns:oel="http://schemas.microsoft.com/office/2019/extlst" xmlns:r="http://schemas.openxmlformats.org/officeDocument/2006/relationships" xmlns:m="http://schemas.openxmlformats.org/officeDocument/2006/math" xmlns:v="urn:schemas-microsoft-com:vml" xmlns:wp14="http://schemas.microsoft.com/office/word/2010/wordprocessingDrawing" xmlns:wp="http://schemas.openxmlformats.org/drawingml/2006/wordprocessingDrawing" xmlns:w10="urn:schemas-microsoft-com:office:word" xmlns:w="http://schemas.openxmlformats.org/wordprocessingml/2006/main" xmlns:w14="http://schemas.microsoft.com/office/word/2010/wordml" xmlns:w15="http://schemas.microsoft.com/office/word/2012/wordml" xmlns:w16cex="http://schemas.microsoft.com/office/word/2018/wordml/cex" xmlns:w16cid="http://schemas.microsoft.com/office/word/2016/wordml/cid" xmlns:w16="http://schemas.microsoft.com/office/word/2018/wordml" xmlns:w16du="http://schemas.microsoft.com/office/word/2023/wordml/word16du" xmlns:w16sdtdh="http://schemas.microsoft.com/office/word/2020/wordml/sdtdatahash" xmlns:w16sdtfl="http://schemas.microsoft.com/office/word/2024/wordml/sdtformatlock" xmlns:w16se="http://schemas.microsoft.com/office/word/2015/wordml/symex" xmlns:wpg="http://schemas.microsoft.com/office/word/2010/wordprocessingGroup" xmlns:wpi="http://schemas.microsoft.com/office/word/2010/wordprocessingInk" xmlns:wne="http://schemas.microsoft.com/office/word/2006/wordml" xmlns:wps="http://schemas.microsoft.com/office/word/2010/wordprocessingShape" mc:Ignorable="w14 w15 w16se w16cid w16 w16cex w16sdtdh w16sdtfl w16du wp14">
   <w:abstractNum w:abstractNumId="0" w15:restartNumberingAfterBreak="0">
     <w:nsid w:val="09192EE5"/>
     <w:multiLevelType w:val="multilevel"/>
@@ -2557,7 +1892,7 @@
 </file>
 
 <file path=word/styles.xml><?xml version="1.0" encoding="utf-8"?>
-<w:styles xmlns:mc="http://schemas.openxmlformats.org/markup-compatibility/2006" xmlns:r="http://schemas.openxmlformats.org/officeDocument/2006/relationships" xmlns:w="http://schemas.openxmlformats.org/wordprocessingml/2006/main" xmlns:w14="http://schemas.microsoft.com/office/word/2010/wordml" xmlns:w15="http://schemas.microsoft.com/office/word/2012/wordml" xmlns:w16cex="http://schemas.microsoft.com/office/word/2018/wordml/cex" xmlns:w16cid="http://schemas.microsoft.com/office/word/2016/wordml/cid" xmlns:w16="http://schemas.microsoft.com/office/word/2018/wordml" xmlns:w16sdtdh="http://schemas.microsoft.com/office/word/2020/wordml/sdtdatahash" xmlns:w16se="http://schemas.microsoft.com/office/word/2015/wordml/symex" mc:Ignorable="w14 w15 w16se w16cid w16 w16cex w16sdtdh">
+<w:styles xmlns:mc="http://schemas.openxmlformats.org/markup-compatibility/2006" xmlns:r="http://schemas.openxmlformats.org/officeDocument/2006/relationships" xmlns:w="http://schemas.openxmlformats.org/wordprocessingml/2006/main" xmlns:w14="http://schemas.microsoft.com/office/word/2010/wordml" xmlns:w15="http://schemas.microsoft.com/office/word/2012/wordml" xmlns:w16cex="http://schemas.microsoft.com/office/word/2018/wordml/cex" xmlns:w16cid="http://schemas.microsoft.com/office/word/2016/wordml/cid" xmlns:w16="http://schemas.microsoft.com/office/word/2018/wordml" xmlns:w16du="http://schemas.microsoft.com/office/word/2023/wordml/word16du" xmlns:w16sdtdh="http://schemas.microsoft.com/office/word/2020/wordml/sdtdatahash" xmlns:w16sdtfl="http://schemas.microsoft.com/office/word/2024/wordml/sdtformatlock" xmlns:w16se="http://schemas.microsoft.com/office/word/2015/wordml/symex" mc:Ignorable="w14 w15 w16se w16cid w16 w16cex w16sdtdh w16sdtfl w16du">
   <w:docDefaults>
     <w:rPrDefault>
       <w:rPr>
@@ -2955,7 +2290,7 @@
     <w:name w:val="Normal"/>
     <w:qFormat/>
   </w:style>
-  <w:style w:type="paragraph" w:styleId="Heading1">
+  <w:style w:type="paragraph" w:styleId="Ttulo1">
     <w:name w:val="heading 1"/>
     <w:basedOn w:val="Normal"/>
     <w:next w:val="Normal"/>
@@ -2973,7 +2308,7 @@
       <w:szCs w:val="48"/>
     </w:rPr>
   </w:style>
-  <w:style w:type="paragraph" w:styleId="Heading2">
+  <w:style w:type="paragraph" w:styleId="Ttulo2">
     <w:name w:val="heading 2"/>
     <w:basedOn w:val="Normal"/>
     <w:next w:val="Normal"/>
@@ -2993,7 +2328,7 @@
       <w:szCs w:val="36"/>
     </w:rPr>
   </w:style>
-  <w:style w:type="paragraph" w:styleId="Heading3">
+  <w:style w:type="paragraph" w:styleId="Ttulo3">
     <w:name w:val="heading 3"/>
     <w:basedOn w:val="Normal"/>
     <w:next w:val="Normal"/>
@@ -3013,7 +2348,7 @@
       <w:szCs w:val="28"/>
     </w:rPr>
   </w:style>
-  <w:style w:type="paragraph" w:styleId="Heading4">
+  <w:style w:type="paragraph" w:styleId="Ttulo4">
     <w:name w:val="heading 4"/>
     <w:basedOn w:val="Normal"/>
     <w:next w:val="Normal"/>
@@ -3033,7 +2368,7 @@
       <w:szCs w:val="24"/>
     </w:rPr>
   </w:style>
-  <w:style w:type="paragraph" w:styleId="Heading5">
+  <w:style w:type="paragraph" w:styleId="Ttulo5">
     <w:name w:val="heading 5"/>
     <w:basedOn w:val="Normal"/>
     <w:next w:val="Normal"/>
@@ -3051,7 +2386,7 @@
       <w:b/>
     </w:rPr>
   </w:style>
-  <w:style w:type="paragraph" w:styleId="Heading6">
+  <w:style w:type="paragraph" w:styleId="Ttulo6">
     <w:name w:val="heading 6"/>
     <w:basedOn w:val="Normal"/>
     <w:next w:val="Normal"/>
@@ -3071,13 +2406,13 @@
       <w:szCs w:val="20"/>
     </w:rPr>
   </w:style>
-  <w:style w:type="character" w:default="1" w:styleId="DefaultParagraphFont">
+  <w:style w:type="character" w:default="1" w:styleId="Fuentedeprrafopredeter">
     <w:name w:val="Default Paragraph Font"/>
     <w:uiPriority w:val="1"/>
     <w:semiHidden/>
     <w:unhideWhenUsed/>
   </w:style>
-  <w:style w:type="table" w:default="1" w:styleId="TableNormal">
+  <w:style w:type="table" w:default="1" w:styleId="Tablanormal">
     <w:name w:val="Normal Table"/>
     <w:uiPriority w:val="99"/>
     <w:semiHidden/>
@@ -3092,13 +2427,13 @@
       </w:tblCellMar>
     </w:tblPr>
   </w:style>
-  <w:style w:type="numbering" w:default="1" w:styleId="NoList">
+  <w:style w:type="numbering" w:default="1" w:styleId="Sinlista">
     <w:name w:val="No List"/>
     <w:uiPriority w:val="99"/>
     <w:semiHidden/>
     <w:unhideWhenUsed/>
   </w:style>
-  <w:style w:type="paragraph" w:styleId="Title">
+  <w:style w:type="paragraph" w:styleId="Ttulo">
     <w:name w:val="Title"/>
     <w:basedOn w:val="Normal"/>
     <w:next w:val="Normal"/>
@@ -3115,9 +2450,9 @@
       <w:szCs w:val="72"/>
     </w:rPr>
   </w:style>
-  <w:style w:type="table" w:styleId="TableGrid">
+  <w:style w:type="table" w:styleId="Tablaconcuadrcula">
     <w:name w:val="Table Grid"/>
-    <w:basedOn w:val="TableNormal"/>
+    <w:basedOn w:val="Tablanormal"/>
     <w:uiPriority w:val="39"/>
     <w:rsid w:val="0087217B"/>
     <w:pPr>
@@ -3150,10 +2485,10 @@
       <w:lang w:eastAsia="en-IN"/>
     </w:rPr>
   </w:style>
-  <w:style w:type="paragraph" w:styleId="Header">
+  <w:style w:type="paragraph" w:styleId="Encabezado">
     <w:name w:val="header"/>
     <w:basedOn w:val="Normal"/>
-    <w:link w:val="HeaderChar"/>
+    <w:link w:val="EncabezadoCar"/>
     <w:uiPriority w:val="99"/>
     <w:unhideWhenUsed/>
     <w:rsid w:val="00971807"/>
@@ -3165,17 +2500,17 @@
       <w:spacing w:after="0" w:line="240" w:lineRule="auto"/>
     </w:pPr>
   </w:style>
-  <w:style w:type="character" w:customStyle="1" w:styleId="HeaderChar">
-    <w:name w:val="Header Char"/>
-    <w:basedOn w:val="DefaultParagraphFont"/>
-    <w:link w:val="Header"/>
+  <w:style w:type="character" w:customStyle="1" w:styleId="EncabezadoCar">
+    <w:name w:val="Encabezado Car"/>
+    <w:basedOn w:val="Fuentedeprrafopredeter"/>
+    <w:link w:val="Encabezado"/>
     <w:uiPriority w:val="99"/>
     <w:rsid w:val="00971807"/>
   </w:style>
-  <w:style w:type="paragraph" w:styleId="Footer">
+  <w:style w:type="paragraph" w:styleId="Piedepgina">
     <w:name w:val="footer"/>
     <w:basedOn w:val="Normal"/>
-    <w:link w:val="FooterChar"/>
+    <w:link w:val="PiedepginaCar"/>
     <w:uiPriority w:val="99"/>
     <w:unhideWhenUsed/>
     <w:rsid w:val="00971807"/>
@@ -3187,14 +2522,14 @@
       <w:spacing w:after="0" w:line="240" w:lineRule="auto"/>
     </w:pPr>
   </w:style>
-  <w:style w:type="character" w:customStyle="1" w:styleId="FooterChar">
-    <w:name w:val="Footer Char"/>
-    <w:basedOn w:val="DefaultParagraphFont"/>
-    <w:link w:val="Footer"/>
+  <w:style w:type="character" w:customStyle="1" w:styleId="PiedepginaCar">
+    <w:name w:val="Pie de página Car"/>
+    <w:basedOn w:val="Fuentedeprrafopredeter"/>
+    <w:link w:val="Piedepgina"/>
     <w:uiPriority w:val="99"/>
     <w:rsid w:val="00971807"/>
   </w:style>
-  <w:style w:type="paragraph" w:styleId="ListParagraph">
+  <w:style w:type="paragraph" w:styleId="Prrafodelista">
     <w:name w:val="List Paragraph"/>
     <w:basedOn w:val="Normal"/>
     <w:uiPriority w:val="34"/>
@@ -3205,9 +2540,9 @@
       <w:contextualSpacing/>
     </w:pPr>
   </w:style>
-  <w:style w:type="character" w:styleId="Hyperlink">
+  <w:style w:type="character" w:styleId="Hipervnculo">
     <w:name w:val="Hyperlink"/>
-    <w:basedOn w:val="DefaultParagraphFont"/>
+    <w:basedOn w:val="Fuentedeprrafopredeter"/>
     <w:uiPriority w:val="99"/>
     <w:unhideWhenUsed/>
     <w:rsid w:val="005D175A"/>
@@ -3216,9 +2551,9 @@
       <w:u w:val="single"/>
     </w:rPr>
   </w:style>
-  <w:style w:type="character" w:styleId="UnresolvedMention">
+  <w:style w:type="character" w:styleId="Mencinsinresolver">
     <w:name w:val="Unresolved Mention"/>
-    <w:basedOn w:val="DefaultParagraphFont"/>
+    <w:basedOn w:val="Fuentedeprrafopredeter"/>
     <w:uiPriority w:val="99"/>
     <w:semiHidden/>
     <w:unhideWhenUsed/>
@@ -3228,7 +2563,7 @@
       <w:shd w:val="clear" w:color="auto" w:fill="E1DFDD"/>
     </w:rPr>
   </w:style>
-  <w:style w:type="paragraph" w:styleId="Subtitle">
+  <w:style w:type="paragraph" w:styleId="Subttulo">
     <w:name w:val="Subtitle"/>
     <w:basedOn w:val="Normal"/>
     <w:next w:val="Normal"/>
@@ -3248,7 +2583,7 @@
     </w:rPr>
   </w:style>
   <w:style w:type="table" w:customStyle="1" w:styleId="a">
-    <w:basedOn w:val="TableNormal"/>
+    <w:basedOn w:val="Tablanormal"/>
     <w:pPr>
       <w:spacing w:after="0" w:line="240" w:lineRule="auto"/>
     </w:pPr>
@@ -3258,7 +2593,7 @@
     </w:tblPr>
   </w:style>
   <w:style w:type="table" w:customStyle="1" w:styleId="a0">
-    <w:basedOn w:val="TableNormal"/>
+    <w:basedOn w:val="Tablanormal"/>
     <w:pPr>
       <w:spacing w:after="0" w:line="240" w:lineRule="auto"/>
     </w:pPr>

</xml_diff>